<commit_message>
nmv 02 06 2026
</commit_message>
<xml_diff>
--- a/TS Jatai Ghanam Project/TS 1.5/TS 1.5 Jatai Sanskrit Corrections.docx
+++ b/TS Jatai Ghanam Project/TS 1.5/TS 1.5 Jatai Sanskrit Corrections.docx
@@ -42,9 +42,8 @@
           <w:szCs w:val="32"/>
           <w:u w:val="single"/>
         </w:rPr>
-        <w:t xml:space="preserve"> Corrections – Observed </w:t>
+        <w:t xml:space="preserve"> Corrections – Observed till </w:t>
       </w:r>
-      <w:proofErr w:type="gramStart"/>
       <w:r>
         <w:rPr>
           <w:b/>
@@ -53,20 +52,8 @@
           <w:szCs w:val="32"/>
           <w:u w:val="single"/>
         </w:rPr>
-        <w:t xml:space="preserve">till </w:t>
+        <w:t>30th June 2026</w:t>
       </w:r>
-      <w:r>
-        <w:rPr>
-          <w:b/>
-          <w:bCs/>
-          <w:sz w:val="32"/>
-          <w:szCs w:val="32"/>
-          <w:highlight w:val="red"/>
-          <w:u w:val="single"/>
-        </w:rPr>
-        <w:t>????</w:t>
-      </w:r>
-      <w:proofErr w:type="gramEnd"/>
     </w:p>
     <w:p>
       <w:pPr>
@@ -289,27 +276,7 @@
                 <w:sz w:val="32"/>
                 <w:szCs w:val="40"/>
               </w:rPr>
-              <w:t>)</w:t>
-            </w:r>
-            <w:proofErr w:type="gramStart"/>
-            <w:r>
-              <w:rPr>
-                <w:rFonts w:ascii="BRH Devanagari Extra" w:hAnsi="BRH Devanagari Extra" w:cs="BRH Devanagari Extra"/>
-                <w:color w:val="000000"/>
-                <w:sz w:val="32"/>
-                <w:szCs w:val="40"/>
-              </w:rPr>
-              <w:t>-  AÉ</w:t>
-            </w:r>
-            <w:proofErr w:type="gramEnd"/>
-            <w:r>
-              <w:rPr>
-                <w:rFonts w:ascii="BRH Devanagari Extra" w:hAnsi="BRH Devanagari Extra" w:cs="BRH Devanagari Extra"/>
-                <w:color w:val="000000"/>
-                <w:sz w:val="32"/>
-                <w:szCs w:val="40"/>
-              </w:rPr>
-              <w:t xml:space="preserve"> | kÉ</w:t>
+              <w:t>)-  AÉ | kÉ</w:t>
             </w:r>
             <w:r>
               <w:rPr>
@@ -588,19 +555,8 @@
                 <w:sz w:val="32"/>
                 <w:szCs w:val="40"/>
               </w:rPr>
-              <w:t>)</w:t>
-            </w:r>
-            <w:proofErr w:type="gramStart"/>
-            <w:r>
-              <w:rPr>
-                <w:rFonts w:ascii="BRH Devanagari Extra" w:hAnsi="BRH Devanagari Extra" w:cs="BRH Devanagari Extra"/>
-                <w:color w:val="000000"/>
-                <w:sz w:val="32"/>
-                <w:szCs w:val="40"/>
-              </w:rPr>
-              <w:t>-  kÉ</w:t>
-            </w:r>
-            <w:proofErr w:type="gramEnd"/>
+              <w:t>)-  kÉ</w:t>
+            </w:r>
             <w:r>
               <w:rPr>
                 <w:rFonts w:ascii="BRH Malayalam Extra" w:hAnsi="BRH Malayalam Extra" w:cs="BRH Devanagari Extra"/>
@@ -946,27 +902,7 @@
                 <w:sz w:val="32"/>
                 <w:szCs w:val="40"/>
               </w:rPr>
-              <w:t>)</w:t>
-            </w:r>
-            <w:proofErr w:type="gramStart"/>
-            <w:r>
-              <w:rPr>
-                <w:rFonts w:ascii="BRH Devanagari Extra" w:hAnsi="BRH Devanagari Extra" w:cs="BRH Devanagari Extra"/>
-                <w:color w:val="000000"/>
-                <w:sz w:val="32"/>
-                <w:szCs w:val="40"/>
-              </w:rPr>
-              <w:t>-  AÉ</w:t>
-            </w:r>
-            <w:proofErr w:type="gramEnd"/>
-            <w:r>
-              <w:rPr>
-                <w:rFonts w:ascii="BRH Devanagari Extra" w:hAnsi="BRH Devanagari Extra" w:cs="BRH Devanagari Extra"/>
-                <w:color w:val="000000"/>
-                <w:sz w:val="32"/>
-                <w:szCs w:val="40"/>
-              </w:rPr>
-              <w:t xml:space="preserve"> | kÉ</w:t>
+              <w:t>)-  AÉ | kÉ</w:t>
             </w:r>
             <w:r>
               <w:rPr>
@@ -1219,19 +1155,8 @@
                 <w:sz w:val="32"/>
                 <w:szCs w:val="40"/>
               </w:rPr>
-              <w:t>)</w:t>
-            </w:r>
-            <w:proofErr w:type="gramStart"/>
-            <w:r>
-              <w:rPr>
-                <w:rFonts w:ascii="BRH Devanagari Extra" w:hAnsi="BRH Devanagari Extra" w:cs="BRH Devanagari Extra"/>
-                <w:color w:val="000000"/>
-                <w:sz w:val="32"/>
-                <w:szCs w:val="40"/>
-              </w:rPr>
-              <w:t>-  kÉ</w:t>
-            </w:r>
-            <w:proofErr w:type="gramEnd"/>
+              <w:t>)-  kÉ</w:t>
+            </w:r>
             <w:r>
               <w:rPr>
                 <w:rFonts w:ascii="BRH Malayalam Extra" w:hAnsi="BRH Malayalam Extra" w:cs="BRH Devanagari Extra"/>
@@ -1478,6 +1403,16 @@
           <w:u w:val="single"/>
         </w:rPr>
       </w:pPr>
+      <w:r>
+        <w:rPr>
+          <w:b/>
+          <w:bCs/>
+          <w:sz w:val="32"/>
+          <w:szCs w:val="32"/>
+          <w:u w:val="single"/>
+        </w:rPr>
+        <w:t>===========</w:t>
+      </w:r>
     </w:p>
     <w:p>
       <w:pPr>
@@ -1792,25 +1727,7 @@
                 <w:sz w:val="32"/>
                 <w:szCs w:val="40"/>
               </w:rPr>
-              <w:t>)</w:t>
-            </w:r>
-            <w:proofErr w:type="gramStart"/>
-            <w:r>
-              <w:rPr>
-                <w:rFonts w:ascii="BRH Devanagari Extra" w:hAnsi="BRH Devanagari Extra" w:cs="BRH Devanagari Extra"/>
-                <w:sz w:val="32"/>
-                <w:szCs w:val="40"/>
-              </w:rPr>
-              <w:t>-  xÉWûþxÉÉ</w:t>
-            </w:r>
-            <w:proofErr w:type="gramEnd"/>
-            <w:r>
-              <w:rPr>
-                <w:rFonts w:ascii="BRH Devanagari Extra" w:hAnsi="BRH Devanagari Extra" w:cs="BRH Devanagari Extra"/>
-                <w:sz w:val="32"/>
-                <w:szCs w:val="40"/>
-              </w:rPr>
-              <w:t xml:space="preserve"> | AÉ | </w:t>
+              <w:t xml:space="preserve">)-  xÉWûþxÉÉ | AÉ | </w:t>
             </w:r>
           </w:p>
           <w:p>
@@ -1995,25 +1912,7 @@
                 <w:sz w:val="32"/>
                 <w:szCs w:val="40"/>
               </w:rPr>
-              <w:t>)</w:t>
-            </w:r>
-            <w:proofErr w:type="gramStart"/>
-            <w:r>
-              <w:rPr>
-                <w:rFonts w:ascii="BRH Devanagari Extra" w:hAnsi="BRH Devanagari Extra" w:cs="BRH Devanagari Extra"/>
-                <w:sz w:val="32"/>
-                <w:szCs w:val="40"/>
-              </w:rPr>
-              <w:t>-  xÉWûþxÉÉ</w:t>
-            </w:r>
-            <w:proofErr w:type="gramEnd"/>
-            <w:r>
-              <w:rPr>
-                <w:rFonts w:ascii="BRH Devanagari Extra" w:hAnsi="BRH Devanagari Extra" w:cs="BRH Devanagari Extra"/>
-                <w:sz w:val="32"/>
-                <w:szCs w:val="40"/>
-              </w:rPr>
-              <w:t xml:space="preserve"> | AÉ | </w:t>
+              <w:t xml:space="preserve">)-  xÉWûþxÉÉ | AÉ | </w:t>
             </w:r>
           </w:p>
           <w:p>
@@ -2211,18 +2110,8 @@
                 <w:sz w:val="32"/>
                 <w:szCs w:val="40"/>
               </w:rPr>
-              <w:t>)</w:t>
-            </w:r>
-            <w:proofErr w:type="gramStart"/>
-            <w:r>
-              <w:rPr>
-                <w:rFonts w:ascii="BRH Devanagari Extra" w:hAnsi="BRH Devanagari Extra" w:cs="BRH Devanagari Extra"/>
-                <w:sz w:val="32"/>
-                <w:szCs w:val="40"/>
-              </w:rPr>
-              <w:t>-  mÉÔ</w:t>
-            </w:r>
-            <w:proofErr w:type="gramEnd"/>
+              <w:t>)-  mÉÔ</w:t>
+            </w:r>
             <w:r>
               <w:rPr>
                 <w:rFonts w:ascii="BRH Malayalam Extra" w:hAnsi="BRH Malayalam Extra" w:cs="BRH Devanagari Extra"/>
@@ -2426,18 +2315,8 @@
                 <w:sz w:val="32"/>
                 <w:szCs w:val="40"/>
               </w:rPr>
-              <w:t>)</w:t>
-            </w:r>
-            <w:proofErr w:type="gramStart"/>
-            <w:r>
-              <w:rPr>
-                <w:rFonts w:ascii="BRH Devanagari Extra" w:hAnsi="BRH Devanagari Extra" w:cs="BRH Devanagari Extra"/>
-                <w:sz w:val="32"/>
-                <w:szCs w:val="40"/>
-              </w:rPr>
-              <w:t>-  mÉÔ</w:t>
-            </w:r>
-            <w:proofErr w:type="gramEnd"/>
+              <w:t>)-  mÉÔ</w:t>
+            </w:r>
             <w:r>
               <w:rPr>
                 <w:rFonts w:ascii="BRH Malayalam Extra" w:hAnsi="BRH Malayalam Extra" w:cs="BRH Devanagari Extra"/>
@@ -2740,25 +2619,7 @@
                 <w:sz w:val="32"/>
                 <w:szCs w:val="40"/>
               </w:rPr>
-              <w:t>)</w:t>
-            </w:r>
-            <w:proofErr w:type="gramStart"/>
-            <w:r>
-              <w:rPr>
-                <w:rFonts w:ascii="BRH Devanagari Extra" w:hAnsi="BRH Devanagari Extra" w:cs="BRH Devanagari Extra"/>
-                <w:sz w:val="32"/>
-                <w:szCs w:val="40"/>
-              </w:rPr>
-              <w:t>-  iuÉ</w:t>
-            </w:r>
-            <w:proofErr w:type="gramEnd"/>
-            <w:r>
-              <w:rPr>
-                <w:rFonts w:ascii="BRH Devanagari Extra" w:hAnsi="BRH Devanagari Extra" w:cs="BRH Devanagari Extra"/>
-                <w:sz w:val="32"/>
-                <w:szCs w:val="40"/>
-              </w:rPr>
-              <w:t>¹Éÿ | AÉ |</w:t>
+              <w:t>)-  iuÉ¹Éÿ | AÉ |</w:t>
             </w:r>
           </w:p>
           <w:p>
@@ -2928,25 +2789,7 @@
                 <w:sz w:val="32"/>
                 <w:szCs w:val="40"/>
               </w:rPr>
-              <w:t>)</w:t>
-            </w:r>
-            <w:proofErr w:type="gramStart"/>
-            <w:r>
-              <w:rPr>
-                <w:rFonts w:ascii="BRH Devanagari Extra" w:hAnsi="BRH Devanagari Extra" w:cs="BRH Devanagari Extra"/>
-                <w:sz w:val="32"/>
-                <w:szCs w:val="40"/>
-              </w:rPr>
-              <w:t>-  iuÉ</w:t>
-            </w:r>
-            <w:proofErr w:type="gramEnd"/>
-            <w:r>
-              <w:rPr>
-                <w:rFonts w:ascii="BRH Devanagari Extra" w:hAnsi="BRH Devanagari Extra" w:cs="BRH Devanagari Extra"/>
-                <w:sz w:val="32"/>
-                <w:szCs w:val="40"/>
-              </w:rPr>
-              <w:t>¹Éÿ | AÉ |</w:t>
+              <w:t>)-  iuÉ¹Éÿ | AÉ |</w:t>
             </w:r>
           </w:p>
           <w:p>
@@ -3121,18 +2964,8 @@
                 <w:sz w:val="32"/>
                 <w:szCs w:val="40"/>
               </w:rPr>
-              <w:t>)</w:t>
-            </w:r>
-            <w:proofErr w:type="gramStart"/>
-            <w:r>
-              <w:rPr>
-                <w:rFonts w:ascii="BRH Devanagari Extra" w:hAnsi="BRH Devanagari Extra" w:cs="BRH Devanagari Extra"/>
-                <w:sz w:val="32"/>
-                <w:szCs w:val="40"/>
-              </w:rPr>
-              <w:t>-  L</w:t>
-            </w:r>
-            <w:proofErr w:type="gramEnd"/>
+              <w:t>)-  L</w:t>
+            </w:r>
             <w:r>
               <w:rPr>
                 <w:rFonts w:ascii="BRH Malayalam Extra" w:hAnsi="BRH Malayalam Extra" w:cs="BRH Devanagari Extra"/>
@@ -3398,18 +3231,8 @@
                 <w:sz w:val="32"/>
                 <w:szCs w:val="40"/>
               </w:rPr>
-              <w:t>)</w:t>
-            </w:r>
-            <w:proofErr w:type="gramStart"/>
-            <w:r>
-              <w:rPr>
-                <w:rFonts w:ascii="BRH Devanagari Extra" w:hAnsi="BRH Devanagari Extra" w:cs="BRH Devanagari Extra"/>
-                <w:sz w:val="32"/>
-                <w:szCs w:val="40"/>
-              </w:rPr>
-              <w:t>-  L</w:t>
-            </w:r>
-            <w:proofErr w:type="gramEnd"/>
+              <w:t>)-  L</w:t>
+            </w:r>
             <w:r>
               <w:rPr>
                 <w:rFonts w:ascii="BRH Malayalam Extra" w:hAnsi="BRH Malayalam Extra" w:cs="BRH Devanagari Extra"/>
@@ -3680,18 +3503,8 @@
                 <w:sz w:val="32"/>
                 <w:szCs w:val="40"/>
               </w:rPr>
-              <w:t>)</w:t>
-            </w:r>
-            <w:proofErr w:type="gramStart"/>
-            <w:r>
-              <w:rPr>
-                <w:rFonts w:ascii="BRH Devanagari Extra" w:hAnsi="BRH Devanagari Extra" w:cs="BRH Devanagari Extra"/>
-                <w:sz w:val="32"/>
-                <w:szCs w:val="40"/>
-              </w:rPr>
-              <w:t>-  L</w:t>
-            </w:r>
-            <w:proofErr w:type="gramEnd"/>
+              <w:t>)-  L</w:t>
+            </w:r>
             <w:r>
               <w:rPr>
                 <w:rFonts w:ascii="BRH Malayalam Extra" w:hAnsi="BRH Malayalam Extra" w:cs="BRH Devanagari Extra"/>
@@ -3961,18 +3774,8 @@
                 <w:sz w:val="32"/>
                 <w:szCs w:val="40"/>
               </w:rPr>
-              <w:t>)</w:t>
-            </w:r>
-            <w:proofErr w:type="gramStart"/>
-            <w:r>
-              <w:rPr>
-                <w:rFonts w:ascii="BRH Devanagari Extra" w:hAnsi="BRH Devanagari Extra" w:cs="BRH Devanagari Extra"/>
-                <w:sz w:val="32"/>
-                <w:szCs w:val="40"/>
-              </w:rPr>
-              <w:t>-  L</w:t>
-            </w:r>
-            <w:proofErr w:type="gramEnd"/>
+              <w:t>)-  L</w:t>
+            </w:r>
             <w:r>
               <w:rPr>
                 <w:rFonts w:ascii="BRH Malayalam Extra" w:hAnsi="BRH Malayalam Extra" w:cs="BRH Devanagari Extra"/>
@@ -4248,25 +4051,7 @@
                 <w:sz w:val="32"/>
                 <w:szCs w:val="40"/>
               </w:rPr>
-              <w:t>)</w:t>
-            </w:r>
-            <w:proofErr w:type="gramStart"/>
-            <w:r>
-              <w:rPr>
-                <w:rFonts w:ascii="BRH Devanagari Extra" w:hAnsi="BRH Devanagari Extra" w:cs="BRH Devanagari Extra"/>
-                <w:sz w:val="32"/>
-                <w:szCs w:val="40"/>
-              </w:rPr>
-              <w:t>-  xÉÈ</w:t>
-            </w:r>
-            <w:proofErr w:type="gramEnd"/>
-            <w:r>
-              <w:rPr>
-                <w:rFonts w:ascii="BRH Devanagari Extra" w:hAnsi="BRH Devanagari Extra" w:cs="BRH Devanagari Extra"/>
-                <w:sz w:val="32"/>
-                <w:szCs w:val="40"/>
-              </w:rPr>
-              <w:t xml:space="preserve"> | uÉÉcÉÿqÉç |</w:t>
+              <w:t>)-  xÉÈ | uÉÉcÉÿqÉç |</w:t>
             </w:r>
           </w:p>
           <w:p>
@@ -4470,25 +4255,7 @@
                 <w:sz w:val="32"/>
                 <w:szCs w:val="40"/>
               </w:rPr>
-              <w:t>)</w:t>
-            </w:r>
-            <w:proofErr w:type="gramStart"/>
-            <w:r>
-              <w:rPr>
-                <w:rFonts w:ascii="BRH Devanagari Extra" w:hAnsi="BRH Devanagari Extra" w:cs="BRH Devanagari Extra"/>
-                <w:sz w:val="32"/>
-                <w:szCs w:val="40"/>
-              </w:rPr>
-              <w:t>-  xÉÈ</w:t>
-            </w:r>
-            <w:proofErr w:type="gramEnd"/>
-            <w:r>
-              <w:rPr>
-                <w:rFonts w:ascii="BRH Devanagari Extra" w:hAnsi="BRH Devanagari Extra" w:cs="BRH Devanagari Extra"/>
-                <w:sz w:val="32"/>
-                <w:szCs w:val="40"/>
-              </w:rPr>
-              <w:t xml:space="preserve"> | uÉÉcÉÿqÉç |</w:t>
+              <w:t>)-  xÉÈ | uÉÉcÉÿqÉç |</w:t>
             </w:r>
           </w:p>
           <w:p>
@@ -4694,18 +4461,8 @@
                 <w:sz w:val="32"/>
                 <w:szCs w:val="40"/>
               </w:rPr>
-              <w:t>)</w:t>
-            </w:r>
-            <w:proofErr w:type="gramStart"/>
-            <w:r>
-              <w:rPr>
-                <w:rFonts w:ascii="BRH Devanagari Extra" w:hAnsi="BRH Devanagari Extra" w:cs="BRH Devanagari Extra"/>
-                <w:sz w:val="32"/>
-                <w:szCs w:val="40"/>
-              </w:rPr>
-              <w:t>-  uÉÉ</w:t>
-            </w:r>
-            <w:proofErr w:type="gramEnd"/>
+              <w:t>)-  uÉÉ</w:t>
+            </w:r>
             <w:r>
               <w:rPr>
                 <w:rFonts w:ascii="BRH Malayalam Extra" w:hAnsi="BRH Malayalam Extra" w:cs="BRH Devanagari Extra"/>
@@ -4981,18 +4738,8 @@
                 <w:sz w:val="32"/>
                 <w:szCs w:val="40"/>
               </w:rPr>
-              <w:t>)</w:t>
-            </w:r>
-            <w:proofErr w:type="gramStart"/>
-            <w:r>
-              <w:rPr>
-                <w:rFonts w:ascii="BRH Devanagari Extra" w:hAnsi="BRH Devanagari Extra" w:cs="BRH Devanagari Extra"/>
-                <w:sz w:val="32"/>
-                <w:szCs w:val="40"/>
-              </w:rPr>
-              <w:t>-  ÌuÉ</w:t>
-            </w:r>
-            <w:proofErr w:type="gramEnd"/>
+              <w:t>)-  ÌuÉ</w:t>
+            </w:r>
             <w:r>
               <w:rPr>
                 <w:rFonts w:ascii="BRH Devanagari Extra" w:hAnsi="BRH Devanagari Extra" w:cs="BRH Devanagari Extra"/>
@@ -5156,16 +4903,7 @@
                 <w:sz w:val="32"/>
                 <w:szCs w:val="40"/>
               </w:rPr>
-              <w:t xml:space="preserve"> </w:t>
-            </w:r>
-            <w:r>
-              <w:rPr>
-                <w:rFonts w:ascii="BRH Devanagari Extra" w:hAnsi="BRH Devanagari Extra" w:cs="BRH Devanagari Extra"/>
-                <w:sz w:val="32"/>
-                <w:szCs w:val="40"/>
-              </w:rPr>
-              <w:lastRenderedPageBreak/>
-              <w:t xml:space="preserve">rÉeÉþqÉÉlÉxrÉ | </w:t>
+              <w:t xml:space="preserve"> rÉeÉþqÉÉlÉxrÉ | </w:t>
             </w:r>
           </w:p>
           <w:p>
@@ -5277,18 +5015,8 @@
                 <w:sz w:val="32"/>
                 <w:szCs w:val="40"/>
               </w:rPr>
-              <w:t>)</w:t>
-            </w:r>
-            <w:proofErr w:type="gramStart"/>
-            <w:r>
-              <w:rPr>
-                <w:rFonts w:ascii="BRH Devanagari Extra" w:hAnsi="BRH Devanagari Extra" w:cs="BRH Devanagari Extra"/>
-                <w:sz w:val="32"/>
-                <w:szCs w:val="40"/>
-              </w:rPr>
-              <w:t>-  ÌuÉ</w:t>
-            </w:r>
-            <w:proofErr w:type="gramEnd"/>
+              <w:t>)-  ÌuÉ</w:t>
+            </w:r>
             <w:r>
               <w:rPr>
                 <w:rFonts w:ascii="BRH Devanagari Extra" w:hAnsi="BRH Devanagari Extra" w:cs="BRH Devanagari Extra"/>
@@ -5329,6 +5057,7 @@
                 <w:sz w:val="32"/>
                 <w:szCs w:val="40"/>
               </w:rPr>
+              <w:lastRenderedPageBreak/>
               <w:t>ÌuÉkÉ×þirÉÉ</w:t>
             </w:r>
             <w:r>
@@ -5507,18 +5236,8 @@
                 <w:sz w:val="32"/>
                 <w:szCs w:val="40"/>
               </w:rPr>
-              <w:t>)</w:t>
-            </w:r>
-            <w:proofErr w:type="gramStart"/>
-            <w:r>
-              <w:rPr>
-                <w:rFonts w:ascii="BRH Devanagari Extra" w:hAnsi="BRH Devanagari Extra" w:cs="BRH Devanagari Extra"/>
-                <w:sz w:val="32"/>
-                <w:szCs w:val="40"/>
-              </w:rPr>
-              <w:t>-  uÉÉ</w:t>
-            </w:r>
-            <w:proofErr w:type="gramEnd"/>
+              <w:t>)-  uÉÉ</w:t>
+            </w:r>
             <w:r>
               <w:rPr>
                 <w:rFonts w:ascii="BRH Malayalam Extra" w:hAnsi="BRH Malayalam Extra" w:cs="BRH Devanagari Extra"/>
@@ -5794,16 +5513,7 @@
                 <w:sz w:val="32"/>
                 <w:szCs w:val="40"/>
               </w:rPr>
-              <w:t>)</w:t>
-            </w:r>
-            <w:proofErr w:type="gramStart"/>
-            <w:r>
-              <w:rPr>
-                <w:rFonts w:ascii="BRH Devanagari Extra" w:hAnsi="BRH Devanagari Extra" w:cs="BRH Devanagari Extra"/>
-                <w:sz w:val="32"/>
-                <w:szCs w:val="40"/>
-              </w:rPr>
-              <w:t>-  ÌuÉ</w:t>
+              <w:t>)-  ÌuÉ</w:t>
             </w:r>
             <w:r>
               <w:rPr>
@@ -5814,7 +5524,6 @@
               </w:rPr>
               <w:t>kÉ</w:t>
             </w:r>
-            <w:proofErr w:type="gramEnd"/>
             <w:r>
               <w:rPr>
                 <w:rFonts w:ascii="BRH Devanagari Extra" w:hAnsi="BRH Devanagari Extra" w:cs="BRH Devanagari Extra"/>
@@ -5991,7 +5700,6 @@
                 <w:sz w:val="32"/>
                 <w:szCs w:val="40"/>
               </w:rPr>
-              <w:lastRenderedPageBreak/>
               <w:t xml:space="preserve">rÉeÉþqÉÉlÉxrÉ | </w:t>
             </w:r>
           </w:p>
@@ -6104,16 +5812,7 @@
                 <w:sz w:val="32"/>
                 <w:szCs w:val="40"/>
               </w:rPr>
-              <w:t>)</w:t>
-            </w:r>
-            <w:proofErr w:type="gramStart"/>
-            <w:r>
-              <w:rPr>
-                <w:rFonts w:ascii="BRH Devanagari Extra" w:hAnsi="BRH Devanagari Extra" w:cs="BRH Devanagari Extra"/>
-                <w:sz w:val="32"/>
-                <w:szCs w:val="40"/>
-              </w:rPr>
-              <w:t>-  ÌuÉ</w:t>
+              <w:t>)-  ÌuÉ</w:t>
             </w:r>
             <w:r>
               <w:rPr>
@@ -6124,7 +5823,6 @@
               </w:rPr>
               <w:t>kÉ</w:t>
             </w:r>
-            <w:proofErr w:type="gramEnd"/>
             <w:r>
               <w:rPr>
                 <w:rFonts w:ascii="BRH Devanagari Extra" w:hAnsi="BRH Devanagari Extra" w:cs="BRH Devanagari Extra"/>
@@ -6156,6 +5854,7 @@
                 <w:sz w:val="32"/>
                 <w:szCs w:val="40"/>
               </w:rPr>
+              <w:lastRenderedPageBreak/>
               <w:t>ÌuÉkÉ×þirÉÉ</w:t>
             </w:r>
             <w:r>
@@ -6339,18 +6038,8 @@
                 <w:sz w:val="32"/>
                 <w:szCs w:val="40"/>
               </w:rPr>
-              <w:t>)</w:t>
-            </w:r>
-            <w:proofErr w:type="gramStart"/>
-            <w:r>
-              <w:rPr>
-                <w:rFonts w:ascii="BRH Devanagari Extra" w:hAnsi="BRH Devanagari Extra" w:cs="BRH Devanagari Extra"/>
-                <w:sz w:val="32"/>
-                <w:szCs w:val="40"/>
-              </w:rPr>
-              <w:t>-  L</w:t>
-            </w:r>
-            <w:proofErr w:type="gramEnd"/>
+              <w:t>)-  L</w:t>
+            </w:r>
             <w:r>
               <w:rPr>
                 <w:rFonts w:ascii="BRH Malayalam Extra" w:hAnsi="BRH Malayalam Extra" w:cs="BRH Devanagari Extra"/>
@@ -6621,18 +6310,8 @@
                 <w:sz w:val="32"/>
                 <w:szCs w:val="40"/>
               </w:rPr>
-              <w:t>)</w:t>
-            </w:r>
-            <w:proofErr w:type="gramStart"/>
-            <w:r>
-              <w:rPr>
-                <w:rFonts w:ascii="BRH Devanagari Extra" w:hAnsi="BRH Devanagari Extra" w:cs="BRH Devanagari Extra"/>
-                <w:sz w:val="32"/>
-                <w:szCs w:val="40"/>
-              </w:rPr>
-              <w:t>-  L</w:t>
-            </w:r>
-            <w:proofErr w:type="gramEnd"/>
+              <w:t>)-  L</w:t>
+            </w:r>
             <w:r>
               <w:rPr>
                 <w:rFonts w:ascii="BRH Malayalam Extra" w:hAnsi="BRH Malayalam Extra" w:cs="BRH Devanagari Extra"/>
@@ -6908,25 +6587,7 @@
                 <w:sz w:val="32"/>
                 <w:szCs w:val="40"/>
               </w:rPr>
-              <w:t>)</w:t>
-            </w:r>
-            <w:proofErr w:type="gramStart"/>
-            <w:r>
-              <w:rPr>
-                <w:rFonts w:ascii="BRH Devanagari Extra" w:hAnsi="BRH Devanagari Extra" w:cs="BRH Devanagari Extra"/>
-                <w:sz w:val="32"/>
-                <w:szCs w:val="40"/>
-              </w:rPr>
-              <w:t>-  AÉ</w:t>
-            </w:r>
-            <w:proofErr w:type="gramEnd"/>
-            <w:r>
-              <w:rPr>
-                <w:rFonts w:ascii="BRH Devanagari Extra" w:hAnsi="BRH Devanagari Extra" w:cs="BRH Devanagari Extra"/>
-                <w:sz w:val="32"/>
-                <w:szCs w:val="40"/>
-              </w:rPr>
-              <w:t xml:space="preserve"> | G</w:t>
+              <w:t>)-  AÉ | G</w:t>
             </w:r>
             <w:r>
               <w:rPr>
@@ -7147,25 +6808,7 @@
                 <w:sz w:val="32"/>
                 <w:szCs w:val="40"/>
               </w:rPr>
-              <w:t>)</w:t>
-            </w:r>
-            <w:proofErr w:type="gramStart"/>
-            <w:r>
-              <w:rPr>
-                <w:rFonts w:ascii="BRH Devanagari Extra" w:hAnsi="BRH Devanagari Extra" w:cs="BRH Devanagari Extra"/>
-                <w:sz w:val="32"/>
-                <w:szCs w:val="40"/>
-              </w:rPr>
-              <w:t>-  AÉ</w:t>
-            </w:r>
-            <w:proofErr w:type="gramEnd"/>
-            <w:r>
-              <w:rPr>
-                <w:rFonts w:ascii="BRH Devanagari Extra" w:hAnsi="BRH Devanagari Extra" w:cs="BRH Devanagari Extra"/>
-                <w:sz w:val="32"/>
-                <w:szCs w:val="40"/>
-              </w:rPr>
-              <w:t xml:space="preserve"> | G</w:t>
+              <w:t>)-  AÉ | G</w:t>
             </w:r>
             <w:r>
               <w:rPr>
@@ -7406,18 +7049,8 @@
                 <w:sz w:val="32"/>
                 <w:szCs w:val="40"/>
               </w:rPr>
-              <w:t>)</w:t>
-            </w:r>
-            <w:proofErr w:type="gramStart"/>
-            <w:r>
-              <w:rPr>
-                <w:rFonts w:ascii="BRH Devanagari Extra" w:hAnsi="BRH Devanagari Extra" w:cs="BRH Devanagari Extra"/>
-                <w:sz w:val="32"/>
-                <w:szCs w:val="40"/>
-              </w:rPr>
-              <w:t>-  A</w:t>
-            </w:r>
-            <w:proofErr w:type="gramEnd"/>
+              <w:t>)-  A</w:t>
+            </w:r>
             <w:r>
               <w:rPr>
                 <w:rFonts w:ascii="BRH Malayalam Extra" w:hAnsi="BRH Malayalam Extra" w:cs="BRH Devanagari Extra"/>
@@ -7836,18 +7469,8 @@
                 <w:sz w:val="32"/>
                 <w:szCs w:val="40"/>
               </w:rPr>
-              <w:t>)</w:t>
-            </w:r>
-            <w:proofErr w:type="gramStart"/>
-            <w:r>
-              <w:rPr>
-                <w:rFonts w:ascii="BRH Devanagari Extra" w:hAnsi="BRH Devanagari Extra" w:cs="BRH Devanagari Extra"/>
-                <w:sz w:val="32"/>
-                <w:szCs w:val="40"/>
-              </w:rPr>
-              <w:t>-  A</w:t>
-            </w:r>
-            <w:proofErr w:type="gramEnd"/>
+              <w:t>)-  A</w:t>
+            </w:r>
             <w:r>
               <w:rPr>
                 <w:rFonts w:ascii="BRH Malayalam Extra" w:hAnsi="BRH Malayalam Extra" w:cs="BRH Devanagari Extra"/>
@@ -8123,18 +7746,8 @@
                 <w:sz w:val="32"/>
                 <w:szCs w:val="40"/>
               </w:rPr>
-              <w:t>)</w:t>
-            </w:r>
-            <w:proofErr w:type="gramStart"/>
-            <w:r>
-              <w:rPr>
-                <w:rFonts w:ascii="BRH Devanagari Extra" w:hAnsi="BRH Devanagari Extra" w:cs="BRH Devanagari Extra"/>
-                <w:sz w:val="32"/>
-                <w:szCs w:val="40"/>
-              </w:rPr>
-              <w:t>-  A</w:t>
-            </w:r>
-            <w:proofErr w:type="gramEnd"/>
+              <w:t>)-  A</w:t>
+            </w:r>
             <w:r>
               <w:rPr>
                 <w:rFonts w:ascii="BRH Malayalam Extra" w:hAnsi="BRH Malayalam Extra" w:cs="BRH Devanagari Extra"/>
@@ -9258,25 +8871,7 @@
                 <w:sz w:val="32"/>
                 <w:szCs w:val="40"/>
               </w:rPr>
-              <w:t>)</w:t>
-            </w:r>
-            <w:proofErr w:type="gramStart"/>
-            <w:r>
-              <w:rPr>
-                <w:rFonts w:ascii="BRH Devanagari Extra" w:hAnsi="BRH Devanagari Extra" w:cs="BRH Devanagari Extra"/>
-                <w:sz w:val="32"/>
-                <w:szCs w:val="40"/>
-              </w:rPr>
-              <w:t>-  ¢</w:t>
-            </w:r>
-            <w:proofErr w:type="gramEnd"/>
-            <w:r>
-              <w:rPr>
-                <w:rFonts w:ascii="BRH Devanagari Extra" w:hAnsi="BRH Devanagari Extra" w:cs="BRH Devanagari Extra"/>
-                <w:sz w:val="32"/>
-                <w:szCs w:val="40"/>
-              </w:rPr>
-              <w:t>Ñü</w:t>
+              <w:t>)-  ¢Ñü</w:t>
             </w:r>
             <w:r>
               <w:rPr>
@@ -9613,18 +9208,8 @@
                 <w:sz w:val="32"/>
                 <w:szCs w:val="40"/>
               </w:rPr>
-              <w:t>)</w:t>
-            </w:r>
-            <w:proofErr w:type="gramStart"/>
-            <w:r>
-              <w:rPr>
-                <w:rFonts w:ascii="BRH Devanagari Extra" w:hAnsi="BRH Devanagari Extra" w:cs="BRH Devanagari Extra"/>
-                <w:sz w:val="32"/>
-                <w:szCs w:val="40"/>
-              </w:rPr>
-              <w:t>-  mÉ</w:t>
-            </w:r>
-            <w:proofErr w:type="gramEnd"/>
+              <w:t>)-  mÉ</w:t>
+            </w:r>
             <w:r>
               <w:rPr>
                 <w:rFonts w:ascii="BRH Malayalam Extra" w:hAnsi="BRH Malayalam Extra" w:cs="BRH Devanagari Extra"/>
@@ -9975,18 +9560,8 @@
                 <w:sz w:val="32"/>
                 <w:szCs w:val="40"/>
               </w:rPr>
-              <w:t>)</w:t>
-            </w:r>
-            <w:proofErr w:type="gramStart"/>
-            <w:r>
-              <w:rPr>
-                <w:rFonts w:ascii="BRH Devanagari Extra" w:hAnsi="BRH Devanagari Extra" w:cs="BRH Devanagari Extra"/>
-                <w:sz w:val="32"/>
-                <w:szCs w:val="40"/>
-              </w:rPr>
-              <w:t>-  mÉ</w:t>
-            </w:r>
-            <w:proofErr w:type="gramEnd"/>
+              <w:t>)-  mÉ</w:t>
+            </w:r>
             <w:r>
               <w:rPr>
                 <w:rFonts w:ascii="BRH Malayalam Extra" w:hAnsi="BRH Malayalam Extra" w:cs="BRH Devanagari Extra"/>
@@ -10219,25 +9794,7 @@
                 <w:sz w:val="32"/>
                 <w:szCs w:val="40"/>
               </w:rPr>
-              <w:t>)</w:t>
-            </w:r>
-            <w:proofErr w:type="gramStart"/>
-            <w:r>
-              <w:rPr>
-                <w:rFonts w:ascii="BRH Devanagari Extra" w:hAnsi="BRH Devanagari Extra" w:cs="BRH Devanagari Extra"/>
-                <w:sz w:val="32"/>
-                <w:szCs w:val="40"/>
-              </w:rPr>
-              <w:t>-  ¢</w:t>
-            </w:r>
-            <w:proofErr w:type="gramEnd"/>
-            <w:r>
-              <w:rPr>
-                <w:rFonts w:ascii="BRH Devanagari Extra" w:hAnsi="BRH Devanagari Extra" w:cs="BRH Devanagari Extra"/>
-                <w:sz w:val="32"/>
-                <w:szCs w:val="40"/>
-              </w:rPr>
-              <w:t>Ñü</w:t>
+              <w:t>)-  ¢Ñü</w:t>
             </w:r>
             <w:r>
               <w:rPr>
@@ -10566,18 +10123,8 @@
                 <w:sz w:val="32"/>
                 <w:szCs w:val="40"/>
               </w:rPr>
-              <w:t>)</w:t>
-            </w:r>
-            <w:proofErr w:type="gramStart"/>
-            <w:r>
-              <w:rPr>
-                <w:rFonts w:ascii="BRH Devanagari Extra" w:hAnsi="BRH Devanagari Extra" w:cs="BRH Devanagari Extra"/>
-                <w:sz w:val="32"/>
-                <w:szCs w:val="40"/>
-              </w:rPr>
-              <w:t>-  mÉ</w:t>
-            </w:r>
-            <w:proofErr w:type="gramEnd"/>
+              <w:t>)-  mÉ</w:t>
+            </w:r>
             <w:r>
               <w:rPr>
                 <w:rFonts w:ascii="BRH Malayalam Extra" w:hAnsi="BRH Malayalam Extra" w:cs="BRH Devanagari Extra"/>
@@ -10920,18 +10467,8 @@
                 <w:sz w:val="32"/>
                 <w:szCs w:val="40"/>
               </w:rPr>
-              <w:t>)</w:t>
-            </w:r>
-            <w:proofErr w:type="gramStart"/>
-            <w:r>
-              <w:rPr>
-                <w:rFonts w:ascii="BRH Devanagari Extra" w:hAnsi="BRH Devanagari Extra" w:cs="BRH Devanagari Extra"/>
-                <w:sz w:val="32"/>
-                <w:szCs w:val="40"/>
-              </w:rPr>
-              <w:t>-  mÉ</w:t>
-            </w:r>
-            <w:proofErr w:type="gramEnd"/>
+              <w:t>)-  mÉ</w:t>
+            </w:r>
             <w:r>
               <w:rPr>
                 <w:rFonts w:ascii="BRH Malayalam Extra" w:hAnsi="BRH Malayalam Extra" w:cs="BRH Devanagari Extra"/>
@@ -11158,25 +10695,7 @@
                 <w:sz w:val="32"/>
                 <w:szCs w:val="40"/>
               </w:rPr>
-              <w:t>)</w:t>
-            </w:r>
-            <w:proofErr w:type="gramStart"/>
-            <w:r>
-              <w:rPr>
-                <w:rFonts w:ascii="BRH Devanagari Extra" w:hAnsi="BRH Devanagari Extra" w:cs="BRH Devanagari Extra"/>
-                <w:sz w:val="32"/>
-                <w:szCs w:val="40"/>
-              </w:rPr>
-              <w:t>-  AuÉþirÉÉï</w:t>
-            </w:r>
-            <w:proofErr w:type="gramEnd"/>
-            <w:r>
-              <w:rPr>
-                <w:rFonts w:ascii="BRH Devanagari Extra" w:hAnsi="BRH Devanagari Extra" w:cs="BRH Devanagari Extra"/>
-                <w:sz w:val="32"/>
-                <w:szCs w:val="40"/>
-              </w:rPr>
-              <w:t xml:space="preserve"> ||</w:t>
+              <w:t>)-  AuÉþirÉÉï ||</w:t>
             </w:r>
           </w:p>
           <w:p>
@@ -11377,25 +10896,7 @@
                 <w:sz w:val="32"/>
                 <w:szCs w:val="40"/>
               </w:rPr>
-              <w:t>)</w:t>
-            </w:r>
-            <w:proofErr w:type="gramStart"/>
-            <w:r>
-              <w:rPr>
-                <w:rFonts w:ascii="BRH Devanagari Extra" w:hAnsi="BRH Devanagari Extra" w:cs="BRH Devanagari Extra"/>
-                <w:sz w:val="32"/>
-                <w:szCs w:val="40"/>
-              </w:rPr>
-              <w:t>-  AuÉþirÉÉï</w:t>
-            </w:r>
-            <w:proofErr w:type="gramEnd"/>
-            <w:r>
-              <w:rPr>
-                <w:rFonts w:ascii="BRH Devanagari Extra" w:hAnsi="BRH Devanagari Extra" w:cs="BRH Devanagari Extra"/>
-                <w:sz w:val="32"/>
-                <w:szCs w:val="40"/>
-              </w:rPr>
-              <w:t xml:space="preserve"> ||</w:t>
+              <w:t>)-  AuÉþirÉÉï ||</w:t>
             </w:r>
           </w:p>
           <w:p>
@@ -11583,18 +11084,8 @@
                 <w:sz w:val="32"/>
                 <w:szCs w:val="40"/>
               </w:rPr>
-              <w:t>)</w:t>
-            </w:r>
-            <w:proofErr w:type="gramStart"/>
-            <w:r>
-              <w:rPr>
-                <w:rFonts w:ascii="BRH Devanagari Extra" w:hAnsi="BRH Devanagari Extra" w:cs="BRH Devanagari Extra"/>
-                <w:sz w:val="32"/>
-                <w:szCs w:val="40"/>
-              </w:rPr>
-              <w:t>-  iÉå</w:t>
-            </w:r>
-            <w:proofErr w:type="gramEnd"/>
+              <w:t>)-  iÉå</w:t>
+            </w:r>
             <w:r>
               <w:rPr>
                 <w:rFonts w:ascii="BRH Malayalam Extra" w:hAnsi="BRH Malayalam Extra" w:cs="BRH Devanagari Extra"/>
@@ -11932,18 +11423,8 @@
                 <w:sz w:val="32"/>
                 <w:szCs w:val="40"/>
               </w:rPr>
-              <w:t>)</w:t>
-            </w:r>
-            <w:proofErr w:type="gramStart"/>
-            <w:r>
-              <w:rPr>
-                <w:rFonts w:ascii="BRH Devanagari Extra" w:hAnsi="BRH Devanagari Extra" w:cs="BRH Devanagari Extra"/>
-                <w:sz w:val="32"/>
-                <w:szCs w:val="40"/>
-              </w:rPr>
-              <w:t>-  qÉ</w:t>
-            </w:r>
-            <w:proofErr w:type="gramEnd"/>
+              <w:t>)-  qÉ</w:t>
+            </w:r>
             <w:r>
               <w:rPr>
                 <w:rFonts w:ascii="BRH Malayalam Extra" w:hAnsi="BRH Malayalam Extra" w:cs="BRH Devanagari Extra"/>
@@ -12363,18 +11844,8 @@
                 <w:sz w:val="32"/>
                 <w:szCs w:val="40"/>
               </w:rPr>
-              <w:t>)</w:t>
-            </w:r>
-            <w:proofErr w:type="gramStart"/>
-            <w:r>
-              <w:rPr>
-                <w:rFonts w:ascii="BRH Devanagari Extra" w:hAnsi="BRH Devanagari Extra" w:cs="BRH Devanagari Extra"/>
-                <w:sz w:val="32"/>
-                <w:szCs w:val="40"/>
-              </w:rPr>
-              <w:t>-  qÉ</w:t>
-            </w:r>
-            <w:proofErr w:type="gramEnd"/>
+              <w:t>)-  qÉ</w:t>
+            </w:r>
             <w:r>
               <w:rPr>
                 <w:rFonts w:ascii="BRH Malayalam Extra" w:hAnsi="BRH Malayalam Extra" w:cs="BRH Devanagari Extra"/>
@@ -12662,18 +12133,8 @@
                 <w:sz w:val="32"/>
                 <w:szCs w:val="40"/>
               </w:rPr>
-              <w:t>)</w:t>
-            </w:r>
-            <w:proofErr w:type="gramStart"/>
-            <w:r>
-              <w:rPr>
-                <w:rFonts w:ascii="BRH Devanagari Extra" w:hAnsi="BRH Devanagari Extra" w:cs="BRH Devanagari Extra"/>
-                <w:sz w:val="32"/>
-                <w:szCs w:val="40"/>
-              </w:rPr>
-              <w:t>-  iÉå</w:t>
-            </w:r>
-            <w:proofErr w:type="gramEnd"/>
+              <w:t>)-  iÉå</w:t>
+            </w:r>
             <w:r>
               <w:rPr>
                 <w:rFonts w:ascii="BRH Malayalam Extra" w:hAnsi="BRH Malayalam Extra" w:cs="BRH Devanagari Extra"/>
@@ -12981,18 +12442,8 @@
                 <w:sz w:val="32"/>
                 <w:szCs w:val="40"/>
               </w:rPr>
-              <w:t>)</w:t>
-            </w:r>
-            <w:proofErr w:type="gramStart"/>
-            <w:r>
-              <w:rPr>
-                <w:rFonts w:ascii="BRH Devanagari Extra" w:hAnsi="BRH Devanagari Extra" w:cs="BRH Devanagari Extra"/>
-                <w:sz w:val="32"/>
-                <w:szCs w:val="40"/>
-              </w:rPr>
-              <w:t>-  qÉ</w:t>
-            </w:r>
-            <w:proofErr w:type="gramEnd"/>
+              <w:t>)-  qÉ</w:t>
+            </w:r>
             <w:r>
               <w:rPr>
                 <w:rFonts w:ascii="BRH Malayalam Extra" w:hAnsi="BRH Malayalam Extra" w:cs="BRH Devanagari Extra"/>
@@ -13384,18 +12835,8 @@
                 <w:sz w:val="32"/>
                 <w:szCs w:val="40"/>
               </w:rPr>
-              <w:t>)</w:t>
-            </w:r>
-            <w:proofErr w:type="gramStart"/>
-            <w:r>
-              <w:rPr>
-                <w:rFonts w:ascii="BRH Devanagari Extra" w:hAnsi="BRH Devanagari Extra" w:cs="BRH Devanagari Extra"/>
-                <w:sz w:val="32"/>
-                <w:szCs w:val="40"/>
-              </w:rPr>
-              <w:t>-  qÉ</w:t>
-            </w:r>
-            <w:proofErr w:type="gramEnd"/>
+              <w:t>)-  qÉ</w:t>
+            </w:r>
             <w:r>
               <w:rPr>
                 <w:rFonts w:ascii="BRH Malayalam Extra" w:hAnsi="BRH Malayalam Extra" w:cs="BRH Devanagari Extra"/>
@@ -13680,18 +13121,8 @@
                 <w:sz w:val="32"/>
                 <w:szCs w:val="40"/>
               </w:rPr>
-              <w:t>)</w:t>
-            </w:r>
-            <w:proofErr w:type="gramStart"/>
-            <w:r>
-              <w:rPr>
-                <w:rFonts w:ascii="BRH Devanagari Extra" w:hAnsi="BRH Devanagari Extra" w:cs="BRH Devanagari Extra"/>
-                <w:sz w:val="32"/>
-                <w:szCs w:val="40"/>
-              </w:rPr>
-              <w:t>-  A</w:t>
-            </w:r>
-            <w:proofErr w:type="gramEnd"/>
+              <w:t>)-  A</w:t>
+            </w:r>
             <w:r>
               <w:rPr>
                 <w:rFonts w:ascii="BRH Malayalam Extra" w:hAnsi="BRH Malayalam Extra" w:cs="BRH Devanagari Extra"/>
@@ -13967,18 +13398,8 @@
                 <w:sz w:val="32"/>
                 <w:szCs w:val="40"/>
               </w:rPr>
-              <w:t>)</w:t>
-            </w:r>
-            <w:proofErr w:type="gramStart"/>
-            <w:r>
-              <w:rPr>
-                <w:rFonts w:ascii="BRH Devanagari Extra" w:hAnsi="BRH Devanagari Extra" w:cs="BRH Devanagari Extra"/>
-                <w:sz w:val="32"/>
-                <w:szCs w:val="40"/>
-              </w:rPr>
-              <w:t>-  A</w:t>
-            </w:r>
-            <w:proofErr w:type="gramEnd"/>
+              <w:t>)-  A</w:t>
+            </w:r>
             <w:r>
               <w:rPr>
                 <w:rFonts w:ascii="BRH Malayalam Extra" w:hAnsi="BRH Malayalam Extra" w:cs="BRH Devanagari Extra"/>
@@ -14259,18 +13680,8 @@
                 <w:sz w:val="32"/>
                 <w:szCs w:val="40"/>
               </w:rPr>
-              <w:t>)</w:t>
-            </w:r>
-            <w:proofErr w:type="gramStart"/>
-            <w:r>
-              <w:rPr>
-                <w:rFonts w:ascii="BRH Devanagari Extra" w:hAnsi="BRH Devanagari Extra" w:cs="BRH Devanagari Extra"/>
-                <w:sz w:val="32"/>
-                <w:szCs w:val="40"/>
-              </w:rPr>
-              <w:t>-  G</w:t>
-            </w:r>
-            <w:proofErr w:type="gramEnd"/>
+              <w:t>)-  G</w:t>
+            </w:r>
             <w:r>
               <w:rPr>
                 <w:rFonts w:ascii="BRH Malayalam Extra" w:hAnsi="BRH Malayalam Extra" w:cs="BRH Devanagari Extra"/>
@@ -14499,18 +13910,8 @@
                 <w:sz w:val="32"/>
                 <w:szCs w:val="40"/>
               </w:rPr>
-              <w:t>)</w:t>
-            </w:r>
-            <w:proofErr w:type="gramStart"/>
-            <w:r>
-              <w:rPr>
-                <w:rFonts w:ascii="BRH Devanagari Extra" w:hAnsi="BRH Devanagari Extra" w:cs="BRH Devanagari Extra"/>
-                <w:sz w:val="32"/>
-                <w:szCs w:val="40"/>
-              </w:rPr>
-              <w:t>-  G</w:t>
-            </w:r>
-            <w:proofErr w:type="gramEnd"/>
+              <w:t>)-  G</w:t>
+            </w:r>
             <w:r>
               <w:rPr>
                 <w:rFonts w:ascii="BRH Malayalam Extra" w:hAnsi="BRH Malayalam Extra" w:cs="BRH Devanagari Extra"/>
@@ -14749,25 +14150,7 @@
                 <w:sz w:val="32"/>
                 <w:szCs w:val="40"/>
               </w:rPr>
-              <w:t>)</w:t>
-            </w:r>
-            <w:proofErr w:type="gramStart"/>
-            <w:r>
-              <w:rPr>
-                <w:rFonts w:ascii="BRH Devanagari Extra" w:hAnsi="BRH Devanagari Extra" w:cs="BRH Devanagari Extra"/>
-                <w:sz w:val="32"/>
-                <w:szCs w:val="40"/>
-              </w:rPr>
-              <w:t>-  zÉ</w:t>
-            </w:r>
-            <w:proofErr w:type="gramEnd"/>
-            <w:r>
-              <w:rPr>
-                <w:rFonts w:ascii="BRH Devanagari Extra" w:hAnsi="BRH Devanagari Extra" w:cs="BRH Devanagari Extra"/>
-                <w:sz w:val="32"/>
-                <w:szCs w:val="40"/>
-              </w:rPr>
-              <w:t>×</w:t>
+              <w:t>)-  zÉ×</w:t>
             </w:r>
             <w:r>
               <w:rPr>
@@ -14993,25 +14376,7 @@
                 <w:sz w:val="32"/>
                 <w:szCs w:val="40"/>
               </w:rPr>
-              <w:t>)</w:t>
-            </w:r>
-            <w:proofErr w:type="gramStart"/>
-            <w:r>
-              <w:rPr>
-                <w:rFonts w:ascii="BRH Devanagari Extra" w:hAnsi="BRH Devanagari Extra" w:cs="BRH Devanagari Extra"/>
-                <w:sz w:val="32"/>
-                <w:szCs w:val="40"/>
-              </w:rPr>
-              <w:t>-  zÉ</w:t>
-            </w:r>
-            <w:proofErr w:type="gramEnd"/>
-            <w:r>
-              <w:rPr>
-                <w:rFonts w:ascii="BRH Devanagari Extra" w:hAnsi="BRH Devanagari Extra" w:cs="BRH Devanagari Extra"/>
-                <w:sz w:val="32"/>
-                <w:szCs w:val="40"/>
-              </w:rPr>
-              <w:t>×</w:t>
+              <w:t>)-  zÉ×</w:t>
             </w:r>
             <w:r>
               <w:rPr>
@@ -15260,18 +14625,8 @@
                 <w:sz w:val="32"/>
                 <w:szCs w:val="40"/>
               </w:rPr>
-              <w:t>)</w:t>
-            </w:r>
-            <w:proofErr w:type="gramStart"/>
-            <w:r>
-              <w:rPr>
-                <w:rFonts w:ascii="BRH Devanagari Extra" w:hAnsi="BRH Devanagari Extra" w:cs="BRH Devanagari Extra"/>
-                <w:sz w:val="32"/>
-                <w:szCs w:val="40"/>
-              </w:rPr>
-              <w:t>-  mÉÉ</w:t>
-            </w:r>
-            <w:proofErr w:type="gramEnd"/>
+              <w:t>)-  mÉÉ</w:t>
+            </w:r>
             <w:r>
               <w:rPr>
                 <w:rFonts w:ascii="BRH Malayalam Extra" w:hAnsi="BRH Malayalam Extra" w:cs="BRH Devanagari Extra"/>
@@ -15680,18 +15035,8 @@
                 <w:sz w:val="32"/>
                 <w:szCs w:val="40"/>
               </w:rPr>
-              <w:t>)</w:t>
-            </w:r>
-            <w:proofErr w:type="gramStart"/>
-            <w:r>
-              <w:rPr>
-                <w:rFonts w:ascii="BRH Devanagari Extra" w:hAnsi="BRH Devanagari Extra" w:cs="BRH Devanagari Extra"/>
-                <w:sz w:val="32"/>
-                <w:szCs w:val="40"/>
-              </w:rPr>
-              <w:t>-  SÏ</w:t>
-            </w:r>
-            <w:proofErr w:type="gramEnd"/>
+              <w:t>)-  SÏ</w:t>
+            </w:r>
             <w:r>
               <w:rPr>
                 <w:rFonts w:ascii="BRH Malayalam Extra" w:hAnsi="BRH Malayalam Extra" w:cs="BRH Devanagari Extra"/>
@@ -15956,18 +15301,8 @@
                 <w:sz w:val="32"/>
                 <w:szCs w:val="40"/>
               </w:rPr>
-              <w:t>)</w:t>
-            </w:r>
-            <w:proofErr w:type="gramStart"/>
-            <w:r>
-              <w:rPr>
-                <w:rFonts w:ascii="BRH Devanagari Extra" w:hAnsi="BRH Devanagari Extra" w:cs="BRH Devanagari Extra"/>
-                <w:sz w:val="32"/>
-                <w:szCs w:val="40"/>
-              </w:rPr>
-              <w:t>-  mÉÉ</w:t>
-            </w:r>
-            <w:proofErr w:type="gramEnd"/>
+              <w:t>)-  mÉÉ</w:t>
+            </w:r>
             <w:r>
               <w:rPr>
                 <w:rFonts w:ascii="BRH Malayalam Extra" w:hAnsi="BRH Malayalam Extra" w:cs="BRH Devanagari Extra"/>
@@ -16520,18 +15855,8 @@
                 <w:sz w:val="32"/>
                 <w:szCs w:val="40"/>
               </w:rPr>
-              <w:t>)</w:t>
-            </w:r>
-            <w:proofErr w:type="gramStart"/>
-            <w:r>
-              <w:rPr>
-                <w:rFonts w:ascii="BRH Devanagari Extra" w:hAnsi="BRH Devanagari Extra" w:cs="BRH Devanagari Extra"/>
-                <w:sz w:val="32"/>
-                <w:szCs w:val="40"/>
-              </w:rPr>
-              <w:t>-  SÏ</w:t>
-            </w:r>
-            <w:proofErr w:type="gramEnd"/>
+              <w:t>)-  SÏ</w:t>
+            </w:r>
             <w:r>
               <w:rPr>
                 <w:rFonts w:ascii="BRH Malayalam Extra" w:hAnsi="BRH Malayalam Extra" w:cs="BRH Devanagari Extra"/>
@@ -17198,18 +16523,8 @@
                 <w:sz w:val="32"/>
                 <w:szCs w:val="40"/>
               </w:rPr>
-              <w:t>)</w:t>
-            </w:r>
-            <w:proofErr w:type="gramStart"/>
-            <w:r>
-              <w:rPr>
-                <w:rFonts w:ascii="BRH Devanagari Extra" w:hAnsi="BRH Devanagari Extra" w:cs="BRH Devanagari Extra"/>
-                <w:sz w:val="32"/>
-                <w:szCs w:val="40"/>
-              </w:rPr>
-              <w:t>-  qÉÉ</w:t>
-            </w:r>
-            <w:proofErr w:type="gramEnd"/>
+              <w:t>)-  qÉÉ</w:t>
+            </w:r>
             <w:r>
               <w:rPr>
                 <w:rFonts w:ascii="BRH Malayalam Extra" w:hAnsi="BRH Malayalam Extra" w:cs="BRH Devanagari Extra"/>
@@ -17378,18 +16693,8 @@
                 <w:sz w:val="32"/>
                 <w:szCs w:val="40"/>
               </w:rPr>
-              <w:t>)</w:t>
-            </w:r>
-            <w:proofErr w:type="gramStart"/>
-            <w:r>
-              <w:rPr>
-                <w:rFonts w:ascii="BRH Devanagari Extra" w:hAnsi="BRH Devanagari Extra" w:cs="BRH Devanagari Extra"/>
-                <w:sz w:val="32"/>
-                <w:szCs w:val="40"/>
-              </w:rPr>
-              <w:t>-  qÉÉ</w:t>
-            </w:r>
-            <w:proofErr w:type="gramEnd"/>
+              <w:t>)-  qÉÉ</w:t>
+            </w:r>
             <w:r>
               <w:rPr>
                 <w:rFonts w:ascii="BRH Malayalam Extra" w:hAnsi="BRH Malayalam Extra" w:cs="BRH Devanagari Extra"/>
@@ -17579,18 +16884,8 @@
                 <w:sz w:val="32"/>
                 <w:szCs w:val="40"/>
               </w:rPr>
-              <w:t>)</w:t>
-            </w:r>
-            <w:proofErr w:type="gramStart"/>
-            <w:r>
-              <w:rPr>
-                <w:rFonts w:ascii="BRH Devanagari Extra" w:hAnsi="BRH Devanagari Extra" w:cs="BRH Devanagari Extra"/>
-                <w:sz w:val="32"/>
-                <w:szCs w:val="40"/>
-              </w:rPr>
-              <w:t>-  G</w:t>
-            </w:r>
-            <w:proofErr w:type="gramEnd"/>
+              <w:t>)-  G</w:t>
+            </w:r>
             <w:r>
               <w:rPr>
                 <w:rFonts w:ascii="BRH Malayalam Extra" w:hAnsi="BRH Malayalam Extra" w:cs="BRH Devanagari Extra"/>
@@ -17877,18 +17172,8 @@
                 <w:sz w:val="32"/>
                 <w:szCs w:val="40"/>
               </w:rPr>
-              <w:t>)</w:t>
-            </w:r>
-            <w:proofErr w:type="gramStart"/>
-            <w:r>
-              <w:rPr>
-                <w:rFonts w:ascii="BRH Devanagari Extra" w:hAnsi="BRH Devanagari Extra" w:cs="BRH Devanagari Extra"/>
-                <w:sz w:val="32"/>
-                <w:szCs w:val="40"/>
-              </w:rPr>
-              <w:t>-  G</w:t>
-            </w:r>
-            <w:proofErr w:type="gramEnd"/>
+              <w:t>)-  G</w:t>
+            </w:r>
             <w:r>
               <w:rPr>
                 <w:rFonts w:ascii="BRH Malayalam Extra" w:hAnsi="BRH Malayalam Extra" w:cs="BRH Devanagari Extra"/>
@@ -18146,18 +17431,8 @@
                 <w:sz w:val="32"/>
                 <w:szCs w:val="40"/>
               </w:rPr>
-              <w:t>)</w:t>
-            </w:r>
-            <w:proofErr w:type="gramStart"/>
-            <w:r>
-              <w:rPr>
-                <w:rFonts w:ascii="BRH Devanagari Extra" w:hAnsi="BRH Devanagari Extra" w:cs="BRH Devanagari Extra"/>
-                <w:sz w:val="32"/>
-                <w:szCs w:val="40"/>
-              </w:rPr>
-              <w:t>-  G</w:t>
-            </w:r>
-            <w:proofErr w:type="gramEnd"/>
+              <w:t>)-  G</w:t>
+            </w:r>
             <w:r>
               <w:rPr>
                 <w:rFonts w:ascii="BRH Malayalam Extra" w:hAnsi="BRH Malayalam Extra" w:cs="BRH Devanagari Extra"/>
@@ -18446,18 +17721,8 @@
                 <w:sz w:val="32"/>
                 <w:szCs w:val="40"/>
               </w:rPr>
-              <w:t>)</w:t>
-            </w:r>
-            <w:proofErr w:type="gramStart"/>
-            <w:r>
-              <w:rPr>
-                <w:rFonts w:ascii="BRH Devanagari Extra" w:hAnsi="BRH Devanagari Extra" w:cs="BRH Devanagari Extra"/>
-                <w:sz w:val="32"/>
-                <w:szCs w:val="40"/>
-              </w:rPr>
-              <w:t>-  G</w:t>
-            </w:r>
-            <w:proofErr w:type="gramEnd"/>
+              <w:t>)-  G</w:t>
+            </w:r>
             <w:r>
               <w:rPr>
                 <w:rFonts w:ascii="BRH Malayalam Extra" w:hAnsi="BRH Malayalam Extra" w:cs="BRH Devanagari Extra"/>
@@ -18756,18 +18021,8 @@
                 <w:sz w:val="32"/>
                 <w:szCs w:val="40"/>
               </w:rPr>
-              <w:t>)</w:t>
-            </w:r>
-            <w:proofErr w:type="gramStart"/>
-            <w:r>
-              <w:rPr>
-                <w:rFonts w:ascii="BRH Devanagari Extra" w:hAnsi="BRH Devanagari Extra" w:cs="BRH Devanagari Extra"/>
-                <w:sz w:val="32"/>
-                <w:szCs w:val="40"/>
-              </w:rPr>
-              <w:t>-  ÌiÉ</w:t>
-            </w:r>
-            <w:proofErr w:type="gramEnd"/>
+              <w:t>)-  ÌiÉ</w:t>
+            </w:r>
             <w:r>
               <w:rPr>
                 <w:rFonts w:ascii="BRH Malayalam Extra" w:hAnsi="BRH Malayalam Extra" w:cs="BRH Devanagari Extra"/>
@@ -19083,16 +18338,7 @@
                 <w:sz w:val="32"/>
                 <w:szCs w:val="40"/>
               </w:rPr>
-              <w:t>)</w:t>
-            </w:r>
-            <w:proofErr w:type="gramStart"/>
-            <w:r>
-              <w:rPr>
-                <w:rFonts w:ascii="BRH Devanagari Extra" w:hAnsi="BRH Devanagari Extra" w:cs="BRH Devanagari Extra"/>
-                <w:sz w:val="32"/>
-                <w:szCs w:val="40"/>
-              </w:rPr>
-              <w:t xml:space="preserve">-  </w:t>
+              <w:t xml:space="preserve">)-  </w:t>
             </w:r>
             <w:r>
               <w:rPr>
@@ -19109,16 +18355,7 @@
                 <w:sz w:val="32"/>
                 <w:szCs w:val="40"/>
               </w:rPr>
-              <w:t>cgÉÉ</w:t>
-            </w:r>
-            <w:proofErr w:type="gramEnd"/>
-            <w:r>
-              <w:rPr>
-                <w:rFonts w:ascii="BRH Devanagari Extra" w:hAnsi="BRH Devanagari Extra" w:cs="BRH Devanagari Extra"/>
-                <w:sz w:val="32"/>
-                <w:szCs w:val="40"/>
-              </w:rPr>
-              <w:t xml:space="preserve"> | L</w:t>
+              <w:t>cgÉÉ | L</w:t>
             </w:r>
             <w:r>
               <w:rPr>
@@ -19318,18 +18555,8 @@
                 <w:sz w:val="32"/>
                 <w:szCs w:val="40"/>
               </w:rPr>
-              <w:t>)</w:t>
-            </w:r>
-            <w:proofErr w:type="gramStart"/>
-            <w:r>
-              <w:rPr>
-                <w:rFonts w:ascii="BRH Devanagari Extra" w:hAnsi="BRH Devanagari Extra" w:cs="BRH Devanagari Extra"/>
-                <w:sz w:val="32"/>
-                <w:szCs w:val="40"/>
-              </w:rPr>
-              <w:t>-  ÌiÉ</w:t>
-            </w:r>
-            <w:proofErr w:type="gramEnd"/>
+              <w:t>)-  ÌiÉ</w:t>
+            </w:r>
             <w:r>
               <w:rPr>
                 <w:rFonts w:ascii="BRH Malayalam Extra" w:hAnsi="BRH Malayalam Extra" w:cs="BRH Devanagari Extra"/>
@@ -19657,16 +18884,7 @@
                 <w:sz w:val="32"/>
                 <w:szCs w:val="40"/>
               </w:rPr>
-              <w:t>)</w:t>
-            </w:r>
-            <w:proofErr w:type="gramStart"/>
-            <w:r>
-              <w:rPr>
-                <w:rFonts w:ascii="BRH Devanagari Extra" w:hAnsi="BRH Devanagari Extra" w:cs="BRH Devanagari Extra"/>
-                <w:sz w:val="32"/>
-                <w:szCs w:val="40"/>
-              </w:rPr>
-              <w:t xml:space="preserve">-  </w:t>
+              <w:t xml:space="preserve">)-  </w:t>
             </w:r>
             <w:r>
               <w:rPr>
@@ -19677,7 +18895,6 @@
               </w:rPr>
               <w:t>rÉÉ</w:t>
             </w:r>
-            <w:proofErr w:type="gramEnd"/>
             <w:r>
               <w:rPr>
                 <w:rFonts w:ascii="BRH Malayalam Extra" w:hAnsi="BRH Malayalam Extra" w:cs="BRH Devanagari Extra"/>
@@ -19916,18 +19133,8 @@
                 <w:sz w:val="32"/>
                 <w:szCs w:val="40"/>
               </w:rPr>
-              <w:t>)</w:t>
-            </w:r>
-            <w:proofErr w:type="gramStart"/>
-            <w:r>
-              <w:rPr>
-                <w:rFonts w:ascii="BRH Devanagari Extra" w:hAnsi="BRH Devanagari Extra" w:cs="BRH Devanagari Extra"/>
-                <w:sz w:val="32"/>
-                <w:szCs w:val="40"/>
-              </w:rPr>
-              <w:t>-  L</w:t>
-            </w:r>
-            <w:proofErr w:type="gramEnd"/>
+              <w:t>)-  L</w:t>
+            </w:r>
             <w:r>
               <w:rPr>
                 <w:rFonts w:ascii="BRH Malayalam Extra" w:hAnsi="BRH Malayalam Extra" w:cs="BRH Devanagari Extra"/>
@@ -20213,18 +19420,8 @@
                 <w:sz w:val="32"/>
                 <w:szCs w:val="40"/>
               </w:rPr>
-              <w:t>)</w:t>
-            </w:r>
-            <w:proofErr w:type="gramStart"/>
-            <w:r>
-              <w:rPr>
-                <w:rFonts w:ascii="BRH Devanagari Extra" w:hAnsi="BRH Devanagari Extra" w:cs="BRH Devanagari Extra"/>
-                <w:sz w:val="32"/>
-                <w:szCs w:val="40"/>
-              </w:rPr>
-              <w:t>-  L</w:t>
-            </w:r>
-            <w:proofErr w:type="gramEnd"/>
+              <w:t>)-  L</w:t>
+            </w:r>
             <w:r>
               <w:rPr>
                 <w:rFonts w:ascii="BRH Malayalam Extra" w:hAnsi="BRH Malayalam Extra" w:cs="BRH Devanagari Extra"/>
@@ -20516,18 +19713,8 @@
                 <w:sz w:val="32"/>
                 <w:szCs w:val="40"/>
               </w:rPr>
-              <w:t>)</w:t>
-            </w:r>
-            <w:proofErr w:type="gramStart"/>
-            <w:r>
-              <w:rPr>
-                <w:rFonts w:ascii="BRH Devanagari Extra" w:hAnsi="BRH Devanagari Extra" w:cs="BRH Devanagari Extra"/>
-                <w:sz w:val="32"/>
-                <w:szCs w:val="40"/>
-              </w:rPr>
-              <w:t>-  L</w:t>
-            </w:r>
-            <w:proofErr w:type="gramEnd"/>
+              <w:t>)-  L</w:t>
+            </w:r>
             <w:r>
               <w:rPr>
                 <w:rFonts w:ascii="BRH Malayalam Extra" w:hAnsi="BRH Malayalam Extra" w:cs="BRH Devanagari Extra"/>
@@ -20816,18 +20003,8 @@
                 <w:sz w:val="32"/>
                 <w:szCs w:val="40"/>
               </w:rPr>
-              <w:t>)</w:t>
-            </w:r>
-            <w:proofErr w:type="gramStart"/>
-            <w:r>
-              <w:rPr>
-                <w:rFonts w:ascii="BRH Devanagari Extra" w:hAnsi="BRH Devanagari Extra" w:cs="BRH Devanagari Extra"/>
-                <w:sz w:val="32"/>
-                <w:szCs w:val="40"/>
-              </w:rPr>
-              <w:t>-  L</w:t>
-            </w:r>
-            <w:proofErr w:type="gramEnd"/>
+              <w:t>)-  L</w:t>
+            </w:r>
             <w:r>
               <w:rPr>
                 <w:rFonts w:ascii="BRH Malayalam Extra" w:hAnsi="BRH Malayalam Extra" w:cs="BRH Devanagari Extra"/>
@@ -21118,25 +20295,7 @@
                 <w:sz w:val="32"/>
                 <w:szCs w:val="40"/>
               </w:rPr>
-              <w:t>)</w:t>
-            </w:r>
-            <w:proofErr w:type="gramStart"/>
-            <w:r>
-              <w:rPr>
-                <w:rFonts w:ascii="BRH Devanagari Extra" w:hAnsi="BRH Devanagari Extra" w:cs="BRH Devanagari Extra"/>
-                <w:sz w:val="32"/>
-                <w:szCs w:val="40"/>
-              </w:rPr>
-              <w:t>-  urÉÑþÌ</w:t>
-            </w:r>
-            <w:proofErr w:type="gramEnd"/>
-            <w:r>
-              <w:rPr>
-                <w:rFonts w:ascii="BRH Devanagari Extra" w:hAnsi="BRH Devanagari Extra" w:cs="BRH Devanagari Extra"/>
-                <w:sz w:val="32"/>
-                <w:szCs w:val="40"/>
-              </w:rPr>
-              <w:t>¹qÉç | L</w:t>
+              <w:t>)-  urÉÑþÌ¹qÉç | L</w:t>
             </w:r>
             <w:r>
               <w:rPr>
@@ -21362,25 +20521,7 @@
                 <w:sz w:val="32"/>
                 <w:szCs w:val="40"/>
               </w:rPr>
-              <w:t>)</w:t>
-            </w:r>
-            <w:proofErr w:type="gramStart"/>
-            <w:r>
-              <w:rPr>
-                <w:rFonts w:ascii="BRH Devanagari Extra" w:hAnsi="BRH Devanagari Extra" w:cs="BRH Devanagari Extra"/>
-                <w:sz w:val="32"/>
-                <w:szCs w:val="40"/>
-              </w:rPr>
-              <w:t>-  urÉÑþÌ</w:t>
-            </w:r>
-            <w:proofErr w:type="gramEnd"/>
-            <w:r>
-              <w:rPr>
-                <w:rFonts w:ascii="BRH Devanagari Extra" w:hAnsi="BRH Devanagari Extra" w:cs="BRH Devanagari Extra"/>
-                <w:sz w:val="32"/>
-                <w:szCs w:val="40"/>
-              </w:rPr>
-              <w:t>¹qÉç | L</w:t>
+              <w:t>)-  urÉÑþÌ¹qÉç | L</w:t>
             </w:r>
             <w:r>
               <w:rPr>
@@ -21604,18 +20745,8 @@
                 <w:sz w:val="32"/>
                 <w:szCs w:val="40"/>
               </w:rPr>
-              <w:t>)</w:t>
-            </w:r>
-            <w:proofErr w:type="gramStart"/>
-            <w:r>
-              <w:rPr>
-                <w:rFonts w:ascii="BRH Devanagari Extra" w:hAnsi="BRH Devanagari Extra" w:cs="BRH Devanagari Extra"/>
-                <w:sz w:val="32"/>
-                <w:szCs w:val="40"/>
-              </w:rPr>
-              <w:t>-  zÉÉ</w:t>
-            </w:r>
-            <w:proofErr w:type="gramEnd"/>
+              <w:t>)-  zÉÉ</w:t>
+            </w:r>
             <w:r>
               <w:rPr>
                 <w:rFonts w:ascii="BRH Malayalam Extra" w:hAnsi="BRH Malayalam Extra" w:cs="BRH Devanagari Extra"/>
@@ -21810,18 +20941,8 @@
                 <w:sz w:val="32"/>
                 <w:szCs w:val="40"/>
               </w:rPr>
-              <w:t>)</w:t>
-            </w:r>
-            <w:proofErr w:type="gramStart"/>
-            <w:r>
-              <w:rPr>
-                <w:rFonts w:ascii="BRH Devanagari Extra" w:hAnsi="BRH Devanagari Extra" w:cs="BRH Devanagari Extra"/>
-                <w:sz w:val="32"/>
-                <w:szCs w:val="40"/>
-              </w:rPr>
-              <w:t>-  zÉÉ</w:t>
-            </w:r>
-            <w:proofErr w:type="gramEnd"/>
+              <w:t>)-  zÉÉ</w:t>
+            </w:r>
             <w:r>
               <w:rPr>
                 <w:rFonts w:ascii="BRH Malayalam Extra" w:hAnsi="BRH Malayalam Extra" w:cs="BRH Devanagari Extra"/>
@@ -22025,18 +21146,8 @@
                 <w:sz w:val="32"/>
                 <w:szCs w:val="40"/>
               </w:rPr>
-              <w:t>)</w:t>
-            </w:r>
-            <w:proofErr w:type="gramStart"/>
-            <w:r>
-              <w:rPr>
-                <w:rFonts w:ascii="BRH Devanagari Extra" w:hAnsi="BRH Devanagari Extra" w:cs="BRH Devanagari Extra"/>
-                <w:sz w:val="32"/>
-                <w:szCs w:val="40"/>
-              </w:rPr>
-              <w:t>-  L</w:t>
-            </w:r>
-            <w:proofErr w:type="gramEnd"/>
+              <w:t>)-  L</w:t>
+            </w:r>
             <w:r>
               <w:rPr>
                 <w:rFonts w:ascii="BRH Malayalam Extra" w:hAnsi="BRH Malayalam Extra" w:cs="BRH Devanagari Extra"/>
@@ -22246,18 +21357,8 @@
                 <w:sz w:val="32"/>
                 <w:szCs w:val="40"/>
               </w:rPr>
-              <w:t>)</w:t>
-            </w:r>
-            <w:proofErr w:type="gramStart"/>
-            <w:r>
-              <w:rPr>
-                <w:rFonts w:ascii="BRH Devanagari Extra" w:hAnsi="BRH Devanagari Extra" w:cs="BRH Devanagari Extra"/>
-                <w:sz w:val="32"/>
-                <w:szCs w:val="40"/>
-              </w:rPr>
-              <w:t>-  L</w:t>
-            </w:r>
-            <w:proofErr w:type="gramEnd"/>
+              <w:t>)-  L</w:t>
+            </w:r>
             <w:r>
               <w:rPr>
                 <w:rFonts w:ascii="BRH Malayalam Extra" w:hAnsi="BRH Malayalam Extra" w:cs="BRH Devanagari Extra"/>
@@ -22469,25 +21570,7 @@
                 <w:sz w:val="32"/>
                 <w:szCs w:val="40"/>
               </w:rPr>
-              <w:t>)</w:t>
-            </w:r>
-            <w:proofErr w:type="gramStart"/>
-            <w:r>
-              <w:rPr>
-                <w:rFonts w:ascii="BRH Devanagari Extra" w:hAnsi="BRH Devanagari Extra" w:cs="BRH Devanagari Extra"/>
-                <w:sz w:val="32"/>
-                <w:szCs w:val="40"/>
-              </w:rPr>
-              <w:t>-  xÉÈ</w:t>
-            </w:r>
-            <w:proofErr w:type="gramEnd"/>
-            <w:r>
-              <w:rPr>
-                <w:rFonts w:ascii="BRH Devanagari Extra" w:hAnsi="BRH Devanagari Extra" w:cs="BRH Devanagari Extra"/>
-                <w:sz w:val="32"/>
-                <w:szCs w:val="40"/>
-              </w:rPr>
-              <w:t xml:space="preserve"> | lÉ</w:t>
+              <w:t>)-  xÉÈ | lÉ</w:t>
             </w:r>
             <w:r>
               <w:rPr>
@@ -22676,25 +21759,7 @@
                 <w:sz w:val="32"/>
                 <w:szCs w:val="40"/>
               </w:rPr>
-              <w:t>)</w:t>
-            </w:r>
-            <w:proofErr w:type="gramStart"/>
-            <w:r>
-              <w:rPr>
-                <w:rFonts w:ascii="BRH Devanagari Extra" w:hAnsi="BRH Devanagari Extra" w:cs="BRH Devanagari Extra"/>
-                <w:sz w:val="32"/>
-                <w:szCs w:val="40"/>
-              </w:rPr>
-              <w:t>-  xÉÈ</w:t>
-            </w:r>
-            <w:proofErr w:type="gramEnd"/>
-            <w:r>
-              <w:rPr>
-                <w:rFonts w:ascii="BRH Devanagari Extra" w:hAnsi="BRH Devanagari Extra" w:cs="BRH Devanagari Extra"/>
-                <w:sz w:val="32"/>
-                <w:szCs w:val="40"/>
-              </w:rPr>
-              <w:t xml:space="preserve"> | lÉ</w:t>
+              <w:t>)-  xÉÈ | lÉ</w:t>
             </w:r>
             <w:r>
               <w:rPr>
@@ -22894,18 +21959,8 @@
                 <w:sz w:val="32"/>
                 <w:szCs w:val="40"/>
               </w:rPr>
-              <w:t>)</w:t>
-            </w:r>
-            <w:proofErr w:type="gramStart"/>
-            <w:r>
-              <w:rPr>
-                <w:rFonts w:ascii="BRH Devanagari Extra" w:hAnsi="BRH Devanagari Extra" w:cs="BRH Devanagari Extra"/>
-                <w:sz w:val="32"/>
-                <w:szCs w:val="40"/>
-              </w:rPr>
-              <w:t>-  ÌuÉ</w:t>
-            </w:r>
-            <w:proofErr w:type="gramEnd"/>
+              <w:t>)-  ÌuÉ</w:t>
+            </w:r>
             <w:r>
               <w:rPr>
                 <w:rFonts w:ascii="BRH Malayalam Extra" w:hAnsi="BRH Malayalam Extra" w:cs="BRH Devanagari Extra"/>
@@ -23140,18 +22195,8 @@
                 <w:sz w:val="32"/>
                 <w:szCs w:val="40"/>
               </w:rPr>
-              <w:t>)</w:t>
-            </w:r>
-            <w:proofErr w:type="gramStart"/>
-            <w:r>
-              <w:rPr>
-                <w:rFonts w:ascii="BRH Devanagari Extra" w:hAnsi="BRH Devanagari Extra" w:cs="BRH Devanagari Extra"/>
-                <w:sz w:val="32"/>
-                <w:szCs w:val="40"/>
-              </w:rPr>
-              <w:t>-  ÌuÉ</w:t>
-            </w:r>
-            <w:proofErr w:type="gramEnd"/>
+              <w:t>)-  ÌuÉ</w:t>
+            </w:r>
             <w:r>
               <w:rPr>
                 <w:rFonts w:ascii="BRH Malayalam Extra" w:hAnsi="BRH Malayalam Extra" w:cs="BRH Devanagari Extra"/>
@@ -23382,25 +22427,7 @@
                 <w:sz w:val="32"/>
                 <w:szCs w:val="40"/>
               </w:rPr>
-              <w:t>)</w:t>
-            </w:r>
-            <w:proofErr w:type="gramStart"/>
-            <w:r>
-              <w:rPr>
-                <w:rFonts w:ascii="BRH Devanagari Extra" w:hAnsi="BRH Devanagari Extra" w:cs="BRH Devanagari Extra"/>
-                <w:sz w:val="32"/>
-                <w:szCs w:val="40"/>
-              </w:rPr>
-              <w:t>-  xÉÈ</w:t>
-            </w:r>
-            <w:proofErr w:type="gramEnd"/>
-            <w:r>
-              <w:rPr>
-                <w:rFonts w:ascii="BRH Devanagari Extra" w:hAnsi="BRH Devanagari Extra" w:cs="BRH Devanagari Extra"/>
-                <w:sz w:val="32"/>
-                <w:szCs w:val="40"/>
-              </w:rPr>
-              <w:t xml:space="preserve"> | qÉÉ</w:t>
+              <w:t>)-  xÉÈ | qÉÉ</w:t>
             </w:r>
             <w:r>
               <w:rPr>
@@ -23634,25 +22661,7 @@
                 <w:sz w:val="32"/>
                 <w:szCs w:val="40"/>
               </w:rPr>
-              <w:t>)</w:t>
-            </w:r>
-            <w:proofErr w:type="gramStart"/>
-            <w:r>
-              <w:rPr>
-                <w:rFonts w:ascii="BRH Devanagari Extra" w:hAnsi="BRH Devanagari Extra" w:cs="BRH Devanagari Extra"/>
-                <w:sz w:val="32"/>
-                <w:szCs w:val="40"/>
-              </w:rPr>
-              <w:t>-  xÉÈ</w:t>
-            </w:r>
-            <w:proofErr w:type="gramEnd"/>
-            <w:r>
-              <w:rPr>
-                <w:rFonts w:ascii="BRH Devanagari Extra" w:hAnsi="BRH Devanagari Extra" w:cs="BRH Devanagari Extra"/>
-                <w:sz w:val="32"/>
-                <w:szCs w:val="40"/>
-              </w:rPr>
-              <w:t xml:space="preserve"> | qÉÉ</w:t>
+              <w:t>)-  xÉÈ | qÉÉ</w:t>
             </w:r>
             <w:r>
               <w:rPr>
@@ -25197,18 +24206,8 @@
                 <w:sz w:val="32"/>
                 <w:szCs w:val="40"/>
               </w:rPr>
-              <w:t>)</w:t>
-            </w:r>
-            <w:proofErr w:type="gramStart"/>
-            <w:r>
-              <w:rPr>
-                <w:rFonts w:ascii="BRH Devanagari Extra" w:hAnsi="BRH Devanagari Extra" w:cs="BRH Devanagari Extra"/>
-                <w:sz w:val="32"/>
-                <w:szCs w:val="40"/>
-              </w:rPr>
-              <w:t>-  L</w:t>
-            </w:r>
-            <w:proofErr w:type="gramEnd"/>
+              <w:t>)-  L</w:t>
+            </w:r>
             <w:r>
               <w:rPr>
                 <w:rFonts w:ascii="BRH Malayalam Extra" w:hAnsi="BRH Malayalam Extra" w:cs="BRH Devanagari Extra"/>
@@ -25493,25 +24492,7 @@
                 <w:sz w:val="32"/>
                 <w:szCs w:val="40"/>
               </w:rPr>
-              <w:t>)</w:t>
-            </w:r>
-            <w:proofErr w:type="gramStart"/>
-            <w:r>
-              <w:rPr>
-                <w:rFonts w:ascii="BRH Devanagari Extra" w:hAnsi="BRH Devanagari Extra" w:cs="BRH Devanagari Extra"/>
-                <w:sz w:val="32"/>
-                <w:szCs w:val="40"/>
-              </w:rPr>
-              <w:t>-  MüuÉÉþÌiÉrÉïˆéû</w:t>
-            </w:r>
-            <w:proofErr w:type="gramEnd"/>
-            <w:r>
-              <w:rPr>
-                <w:rFonts w:ascii="BRH Devanagari Extra" w:hAnsi="BRH Devanagari Extra" w:cs="BRH Devanagari Extra"/>
-                <w:sz w:val="32"/>
-                <w:szCs w:val="40"/>
-              </w:rPr>
-              <w:t xml:space="preserve"> | C</w:t>
+              <w:t>)-  MüuÉÉþÌiÉrÉïˆéû | C</w:t>
             </w:r>
             <w:r>
               <w:rPr>
@@ -25784,25 +24765,7 @@
                 <w:sz w:val="32"/>
                 <w:szCs w:val="40"/>
               </w:rPr>
-              <w:t>)</w:t>
-            </w:r>
-            <w:proofErr w:type="gramStart"/>
-            <w:r>
-              <w:rPr>
-                <w:rFonts w:ascii="BRH Devanagari Extra" w:hAnsi="BRH Devanagari Extra" w:cs="BRH Devanagari Extra"/>
-                <w:sz w:val="32"/>
-                <w:szCs w:val="40"/>
-              </w:rPr>
-              <w:t>-  MüuÉÉþÌiÉrÉïˆéû</w:t>
-            </w:r>
-            <w:proofErr w:type="gramEnd"/>
-            <w:r>
-              <w:rPr>
-                <w:rFonts w:ascii="BRH Devanagari Extra" w:hAnsi="BRH Devanagari Extra" w:cs="BRH Devanagari Extra"/>
-                <w:sz w:val="32"/>
-                <w:szCs w:val="40"/>
-              </w:rPr>
-              <w:t xml:space="preserve"> | (</w:t>
+              <w:t>)-  MüuÉÉþÌiÉrÉïˆéû | (</w:t>
             </w:r>
             <w:r>
               <w:rPr>
@@ -26063,25 +25026,7 @@
                 <w:sz w:val="32"/>
                 <w:szCs w:val="40"/>
               </w:rPr>
-              <w:t>)</w:t>
-            </w:r>
-            <w:proofErr w:type="gramStart"/>
-            <w:r>
-              <w:rPr>
-                <w:rFonts w:ascii="BRH Devanagari Extra" w:hAnsi="BRH Devanagari Extra" w:cs="BRH Devanagari Extra"/>
-                <w:sz w:val="32"/>
-                <w:szCs w:val="40"/>
-              </w:rPr>
-              <w:t>-  xÉÈ</w:t>
-            </w:r>
-            <w:proofErr w:type="gramEnd"/>
-            <w:r>
-              <w:rPr>
-                <w:rFonts w:ascii="BRH Devanagari Extra" w:hAnsi="BRH Devanagari Extra" w:cs="BRH Devanagari Extra"/>
-                <w:sz w:val="32"/>
-                <w:szCs w:val="40"/>
-              </w:rPr>
-              <w:t xml:space="preserve"> | iuÉÉ</w:t>
+              <w:t>)-  xÉÈ | iuÉÉ</w:t>
             </w:r>
             <w:r>
               <w:rPr>
@@ -26253,25 +25198,7 @@
                 <w:sz w:val="32"/>
                 <w:szCs w:val="40"/>
               </w:rPr>
-              <w:t>)</w:t>
-            </w:r>
-            <w:proofErr w:type="gramStart"/>
-            <w:r>
-              <w:rPr>
-                <w:rFonts w:ascii="BRH Devanagari Extra" w:hAnsi="BRH Devanagari Extra" w:cs="BRH Devanagari Extra"/>
-                <w:sz w:val="32"/>
-                <w:szCs w:val="40"/>
-              </w:rPr>
-              <w:t>-  xÉÈ</w:t>
-            </w:r>
-            <w:proofErr w:type="gramEnd"/>
-            <w:r>
-              <w:rPr>
-                <w:rFonts w:ascii="BRH Devanagari Extra" w:hAnsi="BRH Devanagari Extra" w:cs="BRH Devanagari Extra"/>
-                <w:sz w:val="32"/>
-                <w:szCs w:val="40"/>
-              </w:rPr>
-              <w:t xml:space="preserve"> | iuÉÉ</w:t>
+              <w:t>)-  xÉÈ | iuÉÉ</w:t>
             </w:r>
             <w:r>
               <w:rPr>
@@ -26462,25 +25389,7 @@
                 <w:sz w:val="32"/>
                 <w:szCs w:val="40"/>
               </w:rPr>
-              <w:t>)</w:t>
-            </w:r>
-            <w:proofErr w:type="gramStart"/>
-            <w:r>
-              <w:rPr>
-                <w:rFonts w:ascii="BRH Devanagari Extra" w:hAnsi="BRH Devanagari Extra" w:cs="BRH Devanagari Extra"/>
-                <w:sz w:val="32"/>
-                <w:szCs w:val="40"/>
-              </w:rPr>
-              <w:t>-  uÉåÌSþÈ</w:t>
-            </w:r>
-            <w:proofErr w:type="gramEnd"/>
-            <w:r>
-              <w:rPr>
-                <w:rFonts w:ascii="BRH Devanagari Extra" w:hAnsi="BRH Devanagari Extra" w:cs="BRH Devanagari Extra"/>
-                <w:sz w:val="32"/>
-                <w:szCs w:val="40"/>
-              </w:rPr>
-              <w:t xml:space="preserve"> | mÉ</w:t>
+              <w:t>)-  uÉåÌSþÈ | mÉ</w:t>
             </w:r>
             <w:r>
               <w:rPr>
@@ -26757,18 +25666,8 @@
                 <w:sz w:val="32"/>
                 <w:szCs w:val="40"/>
               </w:rPr>
-              <w:t>)</w:t>
-            </w:r>
-            <w:proofErr w:type="gramStart"/>
-            <w:r>
-              <w:rPr>
-                <w:rFonts w:ascii="BRH Devanagari Extra" w:hAnsi="BRH Devanagari Extra" w:cs="BRH Devanagari Extra"/>
-                <w:sz w:val="32"/>
-                <w:szCs w:val="40"/>
-              </w:rPr>
-              <w:t>-  mÉ</w:t>
-            </w:r>
-            <w:proofErr w:type="gramEnd"/>
+              <w:t>)-  mÉ</w:t>
+            </w:r>
             <w:r>
               <w:rPr>
                 <w:rFonts w:ascii="BRH Malayalam Extra" w:hAnsi="BRH Malayalam Extra" w:cs="BRH Devanagari Extra"/>
@@ -27337,25 +26236,7 @@
                 <w:sz w:val="32"/>
                 <w:szCs w:val="40"/>
               </w:rPr>
-              <w:t>)</w:t>
-            </w:r>
-            <w:proofErr w:type="gramStart"/>
-            <w:r>
-              <w:rPr>
-                <w:rFonts w:ascii="BRH Devanagari Extra" w:hAnsi="BRH Devanagari Extra" w:cs="BRH Devanagari Extra"/>
-                <w:sz w:val="32"/>
-                <w:szCs w:val="40"/>
-              </w:rPr>
-              <w:t>-  uÉåÌSþÈ</w:t>
-            </w:r>
-            <w:proofErr w:type="gramEnd"/>
-            <w:r>
-              <w:rPr>
-                <w:rFonts w:ascii="BRH Devanagari Extra" w:hAnsi="BRH Devanagari Extra" w:cs="BRH Devanagari Extra"/>
-                <w:sz w:val="32"/>
-                <w:szCs w:val="40"/>
-              </w:rPr>
-              <w:t xml:space="preserve"> | mÉ</w:t>
+              <w:t>)-  uÉåÌSþÈ | mÉ</w:t>
             </w:r>
             <w:r>
               <w:rPr>
@@ -27645,18 +26526,8 @@
                 <w:sz w:val="32"/>
                 <w:szCs w:val="40"/>
               </w:rPr>
-              <w:t>)</w:t>
-            </w:r>
-            <w:proofErr w:type="gramStart"/>
-            <w:r>
-              <w:rPr>
-                <w:rFonts w:ascii="BRH Devanagari Extra" w:hAnsi="BRH Devanagari Extra" w:cs="BRH Devanagari Extra"/>
-                <w:sz w:val="32"/>
-                <w:szCs w:val="40"/>
-              </w:rPr>
-              <w:t>-  mÉ</w:t>
-            </w:r>
-            <w:proofErr w:type="gramEnd"/>
+              <w:t>)-  mÉ</w:t>
+            </w:r>
             <w:r>
               <w:rPr>
                 <w:rFonts w:ascii="BRH Malayalam Extra" w:hAnsi="BRH Malayalam Extra" w:cs="BRH Devanagari Extra"/>
@@ -27951,18 +26822,8 @@
                 <w:sz w:val="32"/>
                 <w:szCs w:val="40"/>
               </w:rPr>
-              <w:t>)</w:t>
-            </w:r>
-            <w:proofErr w:type="gramStart"/>
-            <w:r>
-              <w:rPr>
-                <w:rFonts w:ascii="BRH Devanagari Extra" w:hAnsi="BRH Devanagari Extra" w:cs="BRH Devanagari Extra"/>
-                <w:sz w:val="32"/>
-                <w:szCs w:val="40"/>
-              </w:rPr>
-              <w:t>-  mÉ</w:t>
-            </w:r>
-            <w:proofErr w:type="gramEnd"/>
+              <w:t>)-  mÉ</w:t>
+            </w:r>
             <w:r>
               <w:rPr>
                 <w:rFonts w:ascii="BRH Malayalam Extra" w:hAnsi="BRH Malayalam Extra" w:cs="BRH Devanagari Extra"/>
@@ -28199,18 +27060,8 @@
                 <w:sz w:val="32"/>
                 <w:szCs w:val="40"/>
               </w:rPr>
-              <w:t>)</w:t>
-            </w:r>
-            <w:proofErr w:type="gramStart"/>
-            <w:r>
-              <w:rPr>
-                <w:rFonts w:ascii="BRH Devanagari Extra" w:hAnsi="BRH Devanagari Extra" w:cs="BRH Devanagari Extra"/>
-                <w:sz w:val="32"/>
-                <w:szCs w:val="40"/>
-              </w:rPr>
-              <w:t>-  A</w:t>
-            </w:r>
-            <w:proofErr w:type="gramEnd"/>
+              <w:t>)-  A</w:t>
+            </w:r>
             <w:r>
               <w:rPr>
                 <w:rFonts w:ascii="BRH Malayalam Extra" w:hAnsi="BRH Malayalam Extra" w:cs="BRH Devanagari Extra"/>
@@ -28405,25 +27256,7 @@
                 <w:sz w:val="32"/>
                 <w:szCs w:val="40"/>
               </w:rPr>
-              <w:t>)</w:t>
-            </w:r>
-            <w:proofErr w:type="gramStart"/>
-            <w:r>
-              <w:rPr>
-                <w:rFonts w:ascii="BRH Devanagari Extra" w:hAnsi="BRH Devanagari Extra" w:cs="BRH Devanagari Extra"/>
-                <w:sz w:val="32"/>
-                <w:szCs w:val="40"/>
-              </w:rPr>
-              <w:t>-  xÉÈ</w:t>
-            </w:r>
-            <w:proofErr w:type="gramEnd"/>
-            <w:r>
-              <w:rPr>
-                <w:rFonts w:ascii="BRH Devanagari Extra" w:hAnsi="BRH Devanagari Extra" w:cs="BRH Devanagari Extra"/>
-                <w:sz w:val="32"/>
-                <w:szCs w:val="40"/>
-              </w:rPr>
-              <w:t xml:space="preserve"> | lÉ</w:t>
+              <w:t>)-  xÉÈ | lÉ</w:t>
             </w:r>
             <w:r>
               <w:rPr>
@@ -28612,18 +27445,8 @@
                 <w:sz w:val="32"/>
                 <w:szCs w:val="40"/>
               </w:rPr>
-              <w:t>)</w:t>
-            </w:r>
-            <w:proofErr w:type="gramStart"/>
-            <w:r>
-              <w:rPr>
-                <w:rFonts w:ascii="BRH Devanagari Extra" w:hAnsi="BRH Devanagari Extra" w:cs="BRH Devanagari Extra"/>
-                <w:sz w:val="32"/>
-                <w:szCs w:val="40"/>
-              </w:rPr>
-              <w:t>-  A</w:t>
-            </w:r>
-            <w:proofErr w:type="gramEnd"/>
+              <w:t>)-  A</w:t>
+            </w:r>
             <w:r>
               <w:rPr>
                 <w:rFonts w:ascii="BRH Malayalam Extra" w:hAnsi="BRH Malayalam Extra" w:cs="BRH Devanagari Extra"/>
@@ -28825,25 +27648,7 @@
                 <w:sz w:val="32"/>
                 <w:szCs w:val="40"/>
               </w:rPr>
-              <w:t>)</w:t>
-            </w:r>
-            <w:proofErr w:type="gramStart"/>
-            <w:r>
-              <w:rPr>
-                <w:rFonts w:ascii="BRH Devanagari Extra" w:hAnsi="BRH Devanagari Extra" w:cs="BRH Devanagari Extra"/>
-                <w:sz w:val="32"/>
-                <w:szCs w:val="40"/>
-              </w:rPr>
-              <w:t>-  xÉÈ</w:t>
-            </w:r>
-            <w:proofErr w:type="gramEnd"/>
-            <w:r>
-              <w:rPr>
-                <w:rFonts w:ascii="BRH Devanagari Extra" w:hAnsi="BRH Devanagari Extra" w:cs="BRH Devanagari Extra"/>
-                <w:sz w:val="32"/>
-                <w:szCs w:val="40"/>
-              </w:rPr>
-              <w:t xml:space="preserve"> | lÉ</w:t>
+              <w:t>)-  xÉÈ | lÉ</w:t>
             </w:r>
             <w:r>
               <w:rPr>
@@ -28933,10 +27738,124 @@
               <w:adjustRightInd w:val="0"/>
               <w:spacing w:before="0" w:line="240" w:lineRule="auto"/>
               <w:rPr>
-                <w:rFonts w:cs="BRH Devanagari Extra"/>
+                <w:rFonts w:ascii="BRH Devanagari Extra" w:hAnsi="BRH Devanagari Extra" w:cs="BRH Devanagari Extra"/>
+                <w:sz w:val="32"/>
                 <w:szCs w:val="40"/>
               </w:rPr>
             </w:pPr>
+            <w:r>
+              <w:rPr>
+                <w:rFonts w:cs="BRH Devanagari Extra"/>
+                <w:szCs w:val="40"/>
+              </w:rPr>
+              <w:t>53</w:t>
+            </w:r>
+            <w:r>
+              <w:rPr>
+                <w:rFonts w:ascii="BRH Devanagari Extra" w:hAnsi="BRH Devanagari Extra" w:cs="BRH Devanagari Extra"/>
+                <w:sz w:val="32"/>
+                <w:szCs w:val="40"/>
+              </w:rPr>
+              <w:t>)</w:t>
+            </w:r>
+            <w:r>
+              <w:rPr>
+                <w:rFonts w:ascii="BRH Devanagari Extra" w:hAnsi="BRH Devanagari Extra" w:cs="BRH Devanagari Extra"/>
+                <w:sz w:val="32"/>
+                <w:szCs w:val="40"/>
+              </w:rPr>
+              <w:tab/>
+            </w:r>
+            <w:r>
+              <w:rPr>
+                <w:rFonts w:cs="BRH Devanagari Extra"/>
+                <w:szCs w:val="40"/>
+              </w:rPr>
+              <w:t>1</w:t>
+            </w:r>
+            <w:r>
+              <w:rPr>
+                <w:rFonts w:ascii="BRH Devanagari Extra" w:hAnsi="BRH Devanagari Extra" w:cs="BRH Devanagari Extra"/>
+                <w:sz w:val="32"/>
+                <w:szCs w:val="40"/>
+              </w:rPr>
+              <w:t>.</w:t>
+            </w:r>
+            <w:r>
+              <w:rPr>
+                <w:rFonts w:cs="BRH Devanagari Extra"/>
+                <w:szCs w:val="40"/>
+              </w:rPr>
+              <w:t>5</w:t>
+            </w:r>
+            <w:r>
+              <w:rPr>
+                <w:rFonts w:ascii="BRH Devanagari Extra" w:hAnsi="BRH Devanagari Extra" w:cs="BRH Devanagari Extra"/>
+                <w:sz w:val="32"/>
+                <w:szCs w:val="40"/>
+              </w:rPr>
+              <w:t>.</w:t>
+            </w:r>
+            <w:r>
+              <w:rPr>
+                <w:rFonts w:cs="BRH Devanagari Extra"/>
+                <w:szCs w:val="40"/>
+              </w:rPr>
+              <w:t>11</w:t>
+            </w:r>
+            <w:r>
+              <w:rPr>
+                <w:rFonts w:ascii="BRH Devanagari Extra" w:hAnsi="BRH Devanagari Extra" w:cs="BRH Devanagari Extra"/>
+                <w:sz w:val="32"/>
+                <w:szCs w:val="40"/>
+              </w:rPr>
+              <w:t>.</w:t>
+            </w:r>
+            <w:r>
+              <w:rPr>
+                <w:rFonts w:cs="BRH Devanagari Extra"/>
+                <w:szCs w:val="40"/>
+              </w:rPr>
+              <w:t>1</w:t>
+            </w:r>
+            <w:r>
+              <w:rPr>
+                <w:rFonts w:ascii="BRH Devanagari Extra" w:hAnsi="BRH Devanagari Extra" w:cs="BRH Devanagari Extra"/>
+                <w:sz w:val="32"/>
+                <w:szCs w:val="40"/>
+              </w:rPr>
+              <w:t>(</w:t>
+            </w:r>
+            <w:r>
+              <w:rPr>
+                <w:rFonts w:cs="BRH Devanagari Extra"/>
+                <w:szCs w:val="40"/>
+              </w:rPr>
+              <w:t>50</w:t>
+            </w:r>
+            <w:r>
+              <w:rPr>
+                <w:rFonts w:ascii="BRH Devanagari Extra" w:hAnsi="BRH Devanagari Extra" w:cs="BRH Devanagari Extra"/>
+                <w:sz w:val="32"/>
+                <w:szCs w:val="40"/>
+              </w:rPr>
+              <w:t>)-  xÉÈ | ËU</w:t>
+            </w:r>
+            <w:r>
+              <w:rPr>
+                <w:rFonts w:ascii="BRH Malayalam Extra" w:hAnsi="BRH Malayalam Extra" w:cs="BRH Devanagari Extra"/>
+                <w:szCs w:val="40"/>
+              </w:rPr>
+              <w:t>–</w:t>
+            </w:r>
+            <w:r>
+              <w:rPr>
+                <w:rFonts w:ascii="BRH Devanagari Extra" w:hAnsi="BRH Devanagari Extra" w:cs="BRH Devanagari Extra"/>
+                <w:sz w:val="32"/>
+                <w:szCs w:val="40"/>
+              </w:rPr>
+              <w:t>wÉÈ |</w:t>
+            </w:r>
           </w:p>
           <w:p>
             <w:pPr>
@@ -28946,177 +27865,6 @@
               <w:adjustRightInd w:val="0"/>
               <w:spacing w:before="0" w:line="240" w:lineRule="auto"/>
               <w:rPr>
-                <w:rFonts w:cs="BRH Devanagari Extra"/>
-                <w:szCs w:val="40"/>
-              </w:rPr>
-            </w:pPr>
-          </w:p>
-          <w:p>
-            <w:pPr>
-              <w:widowControl w:val="0"/>
-              <w:autoSpaceDE w:val="0"/>
-              <w:autoSpaceDN w:val="0"/>
-              <w:adjustRightInd w:val="0"/>
-              <w:spacing w:before="0" w:line="240" w:lineRule="auto"/>
-              <w:rPr>
-                <w:rFonts w:cs="BRH Devanagari Extra"/>
-                <w:szCs w:val="40"/>
-              </w:rPr>
-            </w:pPr>
-          </w:p>
-          <w:p>
-            <w:pPr>
-              <w:widowControl w:val="0"/>
-              <w:autoSpaceDE w:val="0"/>
-              <w:autoSpaceDN w:val="0"/>
-              <w:adjustRightInd w:val="0"/>
-              <w:spacing w:before="0" w:line="240" w:lineRule="auto"/>
-              <w:rPr>
-                <w:rFonts w:ascii="BRH Devanagari Extra" w:hAnsi="BRH Devanagari Extra" w:cs="BRH Devanagari Extra"/>
-                <w:sz w:val="32"/>
-                <w:szCs w:val="40"/>
-              </w:rPr>
-            </w:pPr>
-            <w:r>
-              <w:rPr>
-                <w:rFonts w:cs="BRH Devanagari Extra"/>
-                <w:szCs w:val="40"/>
-              </w:rPr>
-              <w:t>53</w:t>
-            </w:r>
-            <w:r>
-              <w:rPr>
-                <w:rFonts w:ascii="BRH Devanagari Extra" w:hAnsi="BRH Devanagari Extra" w:cs="BRH Devanagari Extra"/>
-                <w:sz w:val="32"/>
-                <w:szCs w:val="40"/>
-              </w:rPr>
-              <w:t>)</w:t>
-            </w:r>
-            <w:r>
-              <w:rPr>
-                <w:rFonts w:ascii="BRH Devanagari Extra" w:hAnsi="BRH Devanagari Extra" w:cs="BRH Devanagari Extra"/>
-                <w:sz w:val="32"/>
-                <w:szCs w:val="40"/>
-              </w:rPr>
-              <w:tab/>
-            </w:r>
-            <w:r>
-              <w:rPr>
-                <w:rFonts w:cs="BRH Devanagari Extra"/>
-                <w:szCs w:val="40"/>
-              </w:rPr>
-              <w:t>1</w:t>
-            </w:r>
-            <w:r>
-              <w:rPr>
-                <w:rFonts w:ascii="BRH Devanagari Extra" w:hAnsi="BRH Devanagari Extra" w:cs="BRH Devanagari Extra"/>
-                <w:sz w:val="32"/>
-                <w:szCs w:val="40"/>
-              </w:rPr>
-              <w:t>.</w:t>
-            </w:r>
-            <w:r>
-              <w:rPr>
-                <w:rFonts w:cs="BRH Devanagari Extra"/>
-                <w:szCs w:val="40"/>
-              </w:rPr>
-              <w:t>5</w:t>
-            </w:r>
-            <w:r>
-              <w:rPr>
-                <w:rFonts w:ascii="BRH Devanagari Extra" w:hAnsi="BRH Devanagari Extra" w:cs="BRH Devanagari Extra"/>
-                <w:sz w:val="32"/>
-                <w:szCs w:val="40"/>
-              </w:rPr>
-              <w:t>.</w:t>
-            </w:r>
-            <w:r>
-              <w:rPr>
-                <w:rFonts w:cs="BRH Devanagari Extra"/>
-                <w:szCs w:val="40"/>
-              </w:rPr>
-              <w:t>11</w:t>
-            </w:r>
-            <w:r>
-              <w:rPr>
-                <w:rFonts w:ascii="BRH Devanagari Extra" w:hAnsi="BRH Devanagari Extra" w:cs="BRH Devanagari Extra"/>
-                <w:sz w:val="32"/>
-                <w:szCs w:val="40"/>
-              </w:rPr>
-              <w:t>.</w:t>
-            </w:r>
-            <w:r>
-              <w:rPr>
-                <w:rFonts w:cs="BRH Devanagari Extra"/>
-                <w:szCs w:val="40"/>
-              </w:rPr>
-              <w:t>1</w:t>
-            </w:r>
-            <w:r>
-              <w:rPr>
-                <w:rFonts w:ascii="BRH Devanagari Extra" w:hAnsi="BRH Devanagari Extra" w:cs="BRH Devanagari Extra"/>
-                <w:sz w:val="32"/>
-                <w:szCs w:val="40"/>
-              </w:rPr>
-              <w:t>(</w:t>
-            </w:r>
-            <w:r>
-              <w:rPr>
-                <w:rFonts w:cs="BRH Devanagari Extra"/>
-                <w:szCs w:val="40"/>
-              </w:rPr>
-              <w:t>50</w:t>
-            </w:r>
-            <w:r>
-              <w:rPr>
-                <w:rFonts w:ascii="BRH Devanagari Extra" w:hAnsi="BRH Devanagari Extra" w:cs="BRH Devanagari Extra"/>
-                <w:sz w:val="32"/>
-                <w:szCs w:val="40"/>
-              </w:rPr>
-              <w:t>)</w:t>
-            </w:r>
-            <w:proofErr w:type="gramStart"/>
-            <w:r>
-              <w:rPr>
-                <w:rFonts w:ascii="BRH Devanagari Extra" w:hAnsi="BRH Devanagari Extra" w:cs="BRH Devanagari Extra"/>
-                <w:sz w:val="32"/>
-                <w:szCs w:val="40"/>
-              </w:rPr>
-              <w:t>-  xÉÈ</w:t>
-            </w:r>
-            <w:proofErr w:type="gramEnd"/>
-            <w:r>
-              <w:rPr>
-                <w:rFonts w:ascii="BRH Devanagari Extra" w:hAnsi="BRH Devanagari Extra" w:cs="BRH Devanagari Extra"/>
-                <w:sz w:val="32"/>
-                <w:szCs w:val="40"/>
-              </w:rPr>
-              <w:t xml:space="preserve"> | ËU</w:t>
-            </w:r>
-            <w:r>
-              <w:rPr>
-                <w:rFonts w:ascii="BRH Malayalam Extra" w:hAnsi="BRH Malayalam Extra" w:cs="BRH Devanagari Extra"/>
-                <w:szCs w:val="40"/>
-              </w:rPr>
-              <w:t>–</w:t>
-            </w:r>
-            <w:r>
-              <w:rPr>
-                <w:rFonts w:ascii="BRH Devanagari Extra" w:hAnsi="BRH Devanagari Extra" w:cs="BRH Devanagari Extra"/>
-                <w:sz w:val="32"/>
-                <w:szCs w:val="40"/>
-              </w:rPr>
-              <w:t>wÉÈ |</w:t>
-            </w:r>
-          </w:p>
-          <w:p>
-            <w:pPr>
-              <w:widowControl w:val="0"/>
-              <w:autoSpaceDE w:val="0"/>
-              <w:autoSpaceDN w:val="0"/>
-              <w:adjustRightInd w:val="0"/>
-              <w:spacing w:before="0" w:line="240" w:lineRule="auto"/>
-              <w:rPr>
                 <w:rFonts w:cs="Latha"/>
                 <w:b/>
                 <w:bCs/>
@@ -29201,45 +27949,6 @@
           <w:tcPr>
             <w:tcW w:w="6662" w:type="dxa"/>
           </w:tcPr>
-          <w:p>
-            <w:pPr>
-              <w:widowControl w:val="0"/>
-              <w:autoSpaceDE w:val="0"/>
-              <w:autoSpaceDN w:val="0"/>
-              <w:adjustRightInd w:val="0"/>
-              <w:spacing w:before="0" w:line="240" w:lineRule="auto"/>
-              <w:rPr>
-                <w:rFonts w:cs="BRH Devanagari Extra"/>
-                <w:szCs w:val="40"/>
-              </w:rPr>
-            </w:pPr>
-          </w:p>
-          <w:p>
-            <w:pPr>
-              <w:widowControl w:val="0"/>
-              <w:autoSpaceDE w:val="0"/>
-              <w:autoSpaceDN w:val="0"/>
-              <w:adjustRightInd w:val="0"/>
-              <w:spacing w:before="0" w:line="240" w:lineRule="auto"/>
-              <w:rPr>
-                <w:rFonts w:cs="BRH Devanagari Extra"/>
-                <w:szCs w:val="40"/>
-              </w:rPr>
-            </w:pPr>
-          </w:p>
-          <w:p>
-            <w:pPr>
-              <w:widowControl w:val="0"/>
-              <w:autoSpaceDE w:val="0"/>
-              <w:autoSpaceDN w:val="0"/>
-              <w:adjustRightInd w:val="0"/>
-              <w:spacing w:before="0" w:line="240" w:lineRule="auto"/>
-              <w:rPr>
-                <w:rFonts w:cs="BRH Devanagari Extra"/>
-                <w:szCs w:val="40"/>
-              </w:rPr>
-            </w:pPr>
-          </w:p>
           <w:p>
             <w:pPr>
               <w:widowControl w:val="0"/>
@@ -29570,18 +28279,8 @@
                 <w:sz w:val="32"/>
                 <w:szCs w:val="40"/>
               </w:rPr>
-              <w:t>)</w:t>
-            </w:r>
-            <w:proofErr w:type="gramStart"/>
-            <w:r>
-              <w:rPr>
-                <w:rFonts w:ascii="BRH Devanagari Extra" w:hAnsi="BRH Devanagari Extra" w:cs="BRH Devanagari Extra"/>
-                <w:sz w:val="32"/>
-                <w:szCs w:val="40"/>
-              </w:rPr>
-              <w:t>-  A</w:t>
-            </w:r>
-            <w:proofErr w:type="gramEnd"/>
+              <w:t>)-  A</w:t>
+            </w:r>
             <w:r>
               <w:rPr>
                 <w:rFonts w:ascii="BRH Malayalam Extra" w:hAnsi="BRH Malayalam Extra" w:cs="BRH Devanagari Extra"/>
@@ -29958,18 +28657,8 @@
                 <w:sz w:val="32"/>
                 <w:szCs w:val="40"/>
               </w:rPr>
-              <w:t>)</w:t>
-            </w:r>
-            <w:proofErr w:type="gramStart"/>
-            <w:r>
-              <w:rPr>
-                <w:rFonts w:ascii="BRH Devanagari Extra" w:hAnsi="BRH Devanagari Extra" w:cs="BRH Devanagari Extra"/>
-                <w:sz w:val="32"/>
-                <w:szCs w:val="40"/>
-              </w:rPr>
-              <w:t>-  mÉë</w:t>
-            </w:r>
-            <w:proofErr w:type="gramEnd"/>
+              <w:t>)-  mÉë</w:t>
+            </w:r>
             <w:r>
               <w:rPr>
                 <w:rFonts w:ascii="BRH Malayalam Extra" w:hAnsi="BRH Malayalam Extra" w:cs="BRH Devanagari Extra"/>
@@ -30172,7 +28861,6 @@
                 <w:rFonts w:cs="BRH Devanagari Extra"/>
                 <w:szCs w:val="40"/>
               </w:rPr>
-              <w:lastRenderedPageBreak/>
               <w:t>37</w:t>
             </w:r>
             <w:r>
@@ -30264,18 +28952,8 @@
                 <w:sz w:val="32"/>
                 <w:szCs w:val="40"/>
               </w:rPr>
-              <w:t>)</w:t>
-            </w:r>
-            <w:proofErr w:type="gramStart"/>
-            <w:r>
-              <w:rPr>
-                <w:rFonts w:ascii="BRH Devanagari Extra" w:hAnsi="BRH Devanagari Extra" w:cs="BRH Devanagari Extra"/>
-                <w:sz w:val="32"/>
-                <w:szCs w:val="40"/>
-              </w:rPr>
-              <w:t>-  mÉë</w:t>
-            </w:r>
-            <w:proofErr w:type="gramEnd"/>
+              <w:t>)-  mÉë</w:t>
+            </w:r>
             <w:r>
               <w:rPr>
                 <w:rFonts w:ascii="BRH Malayalam Extra" w:hAnsi="BRH Malayalam Extra" w:cs="BRH Devanagari Extra"/>
@@ -30338,6 +29016,7 @@
                 <w:sz w:val="32"/>
                 <w:szCs w:val="40"/>
               </w:rPr>
+              <w:lastRenderedPageBreak/>
               <w:t>mÉë</w:t>
             </w:r>
             <w:r>
@@ -31354,7 +30033,6 @@
                 <w:szCs w:val="40"/>
                 <w:lang w:val="it-IT"/>
               </w:rPr>
-              <w:lastRenderedPageBreak/>
               <w:t>37</w:t>
             </w:r>
             <w:r>
@@ -31537,6 +30215,7 @@
                 <w:szCs w:val="40"/>
                 <w:lang w:val="it-IT"/>
               </w:rPr>
+              <w:lastRenderedPageBreak/>
               <w:t>mÉë</w:t>
             </w:r>
             <w:r>
@@ -32563,25 +31242,7 @@
                 <w:sz w:val="32"/>
                 <w:szCs w:val="40"/>
               </w:rPr>
-              <w:t>)</w:t>
-            </w:r>
-            <w:proofErr w:type="gramStart"/>
-            <w:r>
-              <w:rPr>
-                <w:rFonts w:ascii="BRH Devanagari Extra" w:hAnsi="BRH Devanagari Extra" w:cs="BRH Devanagari Extra"/>
-                <w:sz w:val="32"/>
-                <w:szCs w:val="40"/>
-              </w:rPr>
-              <w:t>-  uÉcÉÉ</w:t>
-            </w:r>
-            <w:proofErr w:type="gramEnd"/>
-            <w:r>
-              <w:rPr>
-                <w:rFonts w:ascii="BRH Devanagari Extra" w:hAnsi="BRH Devanagari Extra" w:cs="BRH Devanagari Extra"/>
-                <w:sz w:val="32"/>
-                <w:szCs w:val="40"/>
-              </w:rPr>
-              <w:t>(aqÉçþ)ÍxÉ ||</w:t>
+              <w:t>)-  uÉcÉÉ(aqÉçþ)ÍxÉ ||</w:t>
             </w:r>
           </w:p>
           <w:p>
@@ -32632,7 +31293,6 @@
               </w:rPr>
               <w:t>(aqÉç</w:t>
             </w:r>
-            <w:proofErr w:type="gramStart"/>
             <w:r>
               <w:rPr>
                 <w:rFonts w:ascii="BRH Malayalam Extra" w:hAnsi="BRH Malayalam Extra" w:cs="BRH Devanagari Extra"/>
@@ -32648,7 +31308,6 @@
               </w:rPr>
               <w:t>)xÉÏÌiÉ</w:t>
             </w:r>
-            <w:proofErr w:type="gramEnd"/>
             <w:r>
               <w:rPr>
                 <w:rFonts w:ascii="BRH Malayalam Extra" w:hAnsi="BRH Malayalam Extra" w:cs="BRH Devanagari Extra"/>
@@ -34287,6 +32946,58 @@
         </w:rPr>
         <w:t>=============</w:t>
       </w:r>
+    </w:p>
+    <w:p>
+      <w:pPr>
+        <w:spacing w:before="0" w:line="240" w:lineRule="auto"/>
+        <w:rPr>
+          <w:b/>
+          <w:bCs/>
+          <w:sz w:val="32"/>
+          <w:szCs w:val="32"/>
+          <w:u w:val="single"/>
+          <w:lang w:val="en-IN"/>
+        </w:rPr>
+      </w:pPr>
+    </w:p>
+    <w:p>
+      <w:pPr>
+        <w:spacing w:before="0" w:line="240" w:lineRule="auto"/>
+        <w:rPr>
+          <w:b/>
+          <w:bCs/>
+          <w:sz w:val="32"/>
+          <w:szCs w:val="32"/>
+          <w:u w:val="single"/>
+          <w:lang w:val="en-IN"/>
+        </w:rPr>
+      </w:pPr>
+    </w:p>
+    <w:p>
+      <w:pPr>
+        <w:spacing w:before="0" w:line="240" w:lineRule="auto"/>
+        <w:rPr>
+          <w:b/>
+          <w:bCs/>
+          <w:sz w:val="32"/>
+          <w:szCs w:val="32"/>
+          <w:u w:val="single"/>
+          <w:lang w:val="en-IN"/>
+        </w:rPr>
+      </w:pPr>
+    </w:p>
+    <w:p>
+      <w:pPr>
+        <w:spacing w:before="0" w:line="240" w:lineRule="auto"/>
+        <w:rPr>
+          <w:b/>
+          <w:bCs/>
+          <w:sz w:val="32"/>
+          <w:szCs w:val="32"/>
+          <w:u w:val="single"/>
+          <w:lang w:val="en-IN"/>
+        </w:rPr>
+      </w:pPr>
     </w:p>
     <w:p>
       <w:pPr>
@@ -34335,6 +33046,7 @@
           <w:szCs w:val="32"/>
           <w:u w:val="single"/>
         </w:rPr>
+        <w:lastRenderedPageBreak/>
         <w:t>TS Ghanam – TS 1.</w:t>
       </w:r>
       <w:r>
@@ -34439,7 +33151,6 @@
                 <w:sz w:val="32"/>
                 <w:szCs w:val="32"/>
               </w:rPr>
-              <w:lastRenderedPageBreak/>
               <w:t>Section, Paragraph</w:t>
             </w:r>
           </w:p>
@@ -34659,6 +33370,8 @@
       <w:headerReference w:type="default" r:id="rId8"/>
       <w:footerReference w:type="even" r:id="rId9"/>
       <w:footerReference w:type="default" r:id="rId10"/>
+      <w:headerReference w:type="first" r:id="rId11"/>
+      <w:footerReference w:type="first" r:id="rId12"/>
       <w:pgSz w:w="15840" w:h="12240" w:orient="landscape"/>
       <w:pgMar w:top="1440" w:right="1440" w:bottom="1440" w:left="1440" w:header="720" w:footer="720" w:gutter="0"/>
       <w:cols w:space="720"/>
@@ -34976,7 +33689,7 @@
       <w:tab/>
     </w:r>
     <w:r>
-      <w:t xml:space="preserve">          </w:t>
+      <w:t xml:space="preserve">         </w:t>
     </w:r>
     <w:r>
       <w:rPr>
@@ -35081,6 +33794,16 @@
 </w:ftr>
 </file>
 
+<file path=word/footer3.xml><?xml version="1.0" encoding="utf-8"?>
+<w:ftr xmlns:wpc="http://schemas.microsoft.com/office/word/2010/wordprocessingCanvas" xmlns:cx="http://schemas.microsoft.com/office/drawing/2014/chartex" xmlns:cx1="http://schemas.microsoft.com/office/drawing/2015/9/8/chartex" xmlns:cx2="http://schemas.microsoft.com/office/drawing/2015/10/21/chartex" xmlns:cx3="http://schemas.microsoft.com/office/drawing/2016/5/9/chartex" xmlns:cx4="http://schemas.microsoft.com/office/drawing/2016/5/10/chartex" xmlns:cx5="http://schemas.microsoft.com/office/drawing/2016/5/11/chartex" xmlns:cx6="http://schemas.microsoft.com/office/drawing/2016/5/12/chartex" xmlns:cx7="http://schemas.microsoft.com/office/drawing/2016/5/13/chartex" xmlns:cx8="http://schemas.microsoft.com/office/drawing/2016/5/14/chartex" xmlns:mc="http://schemas.openxmlformats.org/markup-compatibility/2006" xmlns:aink="http://schemas.microsoft.com/office/drawing/2016/ink" xmlns:am3d="http://schemas.microsoft.com/office/drawing/2017/model3d" xmlns:o="urn:schemas-microsoft-com:office:office" xmlns:oel="http://schemas.microsoft.com/office/2019/extlst" xmlns:r="http://schemas.openxmlformats.org/officeDocument/2006/relationships" xmlns:m="http://schemas.openxmlformats.org/officeDocument/2006/math" xmlns:v="urn:schemas-microsoft-com:vml" xmlns:wp14="http://schemas.microsoft.com/office/word/2010/wordprocessingDrawing" xmlns:wp="http://schemas.openxmlformats.org/drawingml/2006/wordprocessingDrawing" xmlns:w10="urn:schemas-microsoft-com:office:word" xmlns:w="http://schemas.openxmlformats.org/wordprocessingml/2006/main" xmlns:w14="http://schemas.microsoft.com/office/word/2010/wordml" xmlns:w15="http://schemas.microsoft.com/office/word/2012/wordml" xmlns:w16cex="http://schemas.microsoft.com/office/word/2018/wordml/cex" xmlns:w16cid="http://schemas.microsoft.com/office/word/2016/wordml/cid" xmlns:w16="http://schemas.microsoft.com/office/word/2018/wordml" xmlns:w16du="http://schemas.microsoft.com/office/word/2023/wordml/word16du" xmlns:w16sdtdh="http://schemas.microsoft.com/office/word/2020/wordml/sdtdatahash" xmlns:w16sdtfl="http://schemas.microsoft.com/office/word/2024/wordml/sdtformatlock" xmlns:w16se="http://schemas.microsoft.com/office/word/2015/wordml/symex" xmlns:wpg="http://schemas.microsoft.com/office/word/2010/wordprocessingGroup" xmlns:wpi="http://schemas.microsoft.com/office/word/2010/wordprocessingInk" xmlns:wne="http://schemas.microsoft.com/office/word/2006/wordml" xmlns:wps="http://schemas.microsoft.com/office/word/2010/wordprocessingShape" mc:Ignorable="w14 w15 w16se w16cid w16 w16cex w16sdtdh w16sdtfl w16du wp14">
+  <w:p>
+    <w:pPr>
+      <w:pStyle w:val="Footer"/>
+    </w:pPr>
+  </w:p>
+</w:ftr>
+</file>
+
 <file path=word/footnotes.xml><?xml version="1.0" encoding="utf-8"?>
 <w:footnotes xmlns:wpc="http://schemas.microsoft.com/office/word/2010/wordprocessingCanvas" xmlns:cx="http://schemas.microsoft.com/office/drawing/2014/chartex" xmlns:cx1="http://schemas.microsoft.com/office/drawing/2015/9/8/chartex" xmlns:cx2="http://schemas.microsoft.com/office/drawing/2015/10/21/chartex" xmlns:cx3="http://schemas.microsoft.com/office/drawing/2016/5/9/chartex" xmlns:cx4="http://schemas.microsoft.com/office/drawing/2016/5/10/chartex" xmlns:cx5="http://schemas.microsoft.com/office/drawing/2016/5/11/chartex" xmlns:cx6="http://schemas.microsoft.com/office/drawing/2016/5/12/chartex" xmlns:cx7="http://schemas.microsoft.com/office/drawing/2016/5/13/chartex" xmlns:cx8="http://schemas.microsoft.com/office/drawing/2016/5/14/chartex" xmlns:mc="http://schemas.openxmlformats.org/markup-compatibility/2006" xmlns:aink="http://schemas.microsoft.com/office/drawing/2016/ink" xmlns:am3d="http://schemas.microsoft.com/office/drawing/2017/model3d" xmlns:o="urn:schemas-microsoft-com:office:office" xmlns:oel="http://schemas.microsoft.com/office/2019/extlst" xmlns:r="http://schemas.openxmlformats.org/officeDocument/2006/relationships" xmlns:m="http://schemas.openxmlformats.org/officeDocument/2006/math" xmlns:v="urn:schemas-microsoft-com:vml" xmlns:wp14="http://schemas.microsoft.com/office/word/2010/wordprocessingDrawing" xmlns:wp="http://schemas.openxmlformats.org/drawingml/2006/wordprocessingDrawing" xmlns:w10="urn:schemas-microsoft-com:office:word" xmlns:w="http://schemas.openxmlformats.org/wordprocessingml/2006/main" xmlns:w14="http://schemas.microsoft.com/office/word/2010/wordml" xmlns:w15="http://schemas.microsoft.com/office/word/2012/wordml" xmlns:w16cex="http://schemas.microsoft.com/office/word/2018/wordml/cex" xmlns:w16cid="http://schemas.microsoft.com/office/word/2016/wordml/cid" xmlns:w16="http://schemas.microsoft.com/office/word/2018/wordml" xmlns:w16du="http://schemas.microsoft.com/office/word/2023/wordml/word16du" xmlns:w16sdtdh="http://schemas.microsoft.com/office/word/2020/wordml/sdtdatahash" xmlns:w16sdtfl="http://schemas.microsoft.com/office/word/2024/wordml/sdtformatlock" xmlns:w16se="http://schemas.microsoft.com/office/word/2015/wordml/symex" xmlns:wpg="http://schemas.microsoft.com/office/word/2010/wordprocessingGroup" xmlns:wpi="http://schemas.microsoft.com/office/word/2010/wordprocessingInk" xmlns:wne="http://schemas.microsoft.com/office/word/2006/wordml" xmlns:wps="http://schemas.microsoft.com/office/word/2010/wordprocessingShape" mc:Ignorable="w14 w15 w16se w16cid w16 w16cex w16sdtdh w16sdtfl w16du wp14">
   <w:footnote w:type="separator" w:id="-1">
@@ -35135,6 +33858,16 @@
       <w:pBdr>
         <w:bottom w:val="single" w:sz="4" w:space="1" w:color="auto"/>
       </w:pBdr>
+    </w:pPr>
+  </w:p>
+</w:hdr>
+</file>
+
+<file path=word/header3.xml><?xml version="1.0" encoding="utf-8"?>
+<w:hdr xmlns:wpc="http://schemas.microsoft.com/office/word/2010/wordprocessingCanvas" xmlns:cx="http://schemas.microsoft.com/office/drawing/2014/chartex" xmlns:cx1="http://schemas.microsoft.com/office/drawing/2015/9/8/chartex" xmlns:cx2="http://schemas.microsoft.com/office/drawing/2015/10/21/chartex" xmlns:cx3="http://schemas.microsoft.com/office/drawing/2016/5/9/chartex" xmlns:cx4="http://schemas.microsoft.com/office/drawing/2016/5/10/chartex" xmlns:cx5="http://schemas.microsoft.com/office/drawing/2016/5/11/chartex" xmlns:cx6="http://schemas.microsoft.com/office/drawing/2016/5/12/chartex" xmlns:cx7="http://schemas.microsoft.com/office/drawing/2016/5/13/chartex" xmlns:cx8="http://schemas.microsoft.com/office/drawing/2016/5/14/chartex" xmlns:mc="http://schemas.openxmlformats.org/markup-compatibility/2006" xmlns:aink="http://schemas.microsoft.com/office/drawing/2016/ink" xmlns:am3d="http://schemas.microsoft.com/office/drawing/2017/model3d" xmlns:o="urn:schemas-microsoft-com:office:office" xmlns:oel="http://schemas.microsoft.com/office/2019/extlst" xmlns:r="http://schemas.openxmlformats.org/officeDocument/2006/relationships" xmlns:m="http://schemas.openxmlformats.org/officeDocument/2006/math" xmlns:v="urn:schemas-microsoft-com:vml" xmlns:wp14="http://schemas.microsoft.com/office/word/2010/wordprocessingDrawing" xmlns:wp="http://schemas.openxmlformats.org/drawingml/2006/wordprocessingDrawing" xmlns:w10="urn:schemas-microsoft-com:office:word" xmlns:w="http://schemas.openxmlformats.org/wordprocessingml/2006/main" xmlns:w14="http://schemas.microsoft.com/office/word/2010/wordml" xmlns:w15="http://schemas.microsoft.com/office/word/2012/wordml" xmlns:w16cex="http://schemas.microsoft.com/office/word/2018/wordml/cex" xmlns:w16cid="http://schemas.microsoft.com/office/word/2016/wordml/cid" xmlns:w16="http://schemas.microsoft.com/office/word/2018/wordml" xmlns:w16du="http://schemas.microsoft.com/office/word/2023/wordml/word16du" xmlns:w16sdtdh="http://schemas.microsoft.com/office/word/2020/wordml/sdtdatahash" xmlns:w16sdtfl="http://schemas.microsoft.com/office/word/2024/wordml/sdtformatlock" xmlns:w16se="http://schemas.microsoft.com/office/word/2015/wordml/symex" xmlns:wpg="http://schemas.microsoft.com/office/word/2010/wordprocessingGroup" xmlns:wpi="http://schemas.microsoft.com/office/word/2010/wordprocessingInk" xmlns:wne="http://schemas.microsoft.com/office/word/2006/wordml" xmlns:wps="http://schemas.microsoft.com/office/word/2010/wordprocessingShape" mc:Ignorable="w14 w15 w16se w16cid w16 w16cex w16sdtdh w16sdtfl w16du wp14">
+  <w:p>
+    <w:pPr>
+      <w:pStyle w:val="Header"/>
     </w:pPr>
   </w:p>
 </w:hdr>

</xml_diff>